<commit_message>
ref: fix lab 2 documentation
</commit_message>
<xml_diff>
--- a/Lab2/Documentation.docx
+++ b/Lab2/Documentation.docx
@@ -1865,7 +1865,23 @@
           <w:sz w:val="28"/>
           <w:szCs w:val="28"/>
         </w:rPr>
-        <w:t>Отсортировать данные входного файла в соответствии с заданным порядком сортировки ключей (см. свой вариант задания). Данные в выходном файле должны быть представлены в табличном виде, первый и второй столбец должны содержать значения ключей в соответствии с заданным порядком сортировки, третий столбец - номер строки входного файла.</w:t>
+        <w:t>Отсортировать данные входного файла</w:t>
+      </w:r>
+      <w:r>
+        <w:rPr>
+          <w:bCs/>
+          <w:sz w:val="28"/>
+          <w:szCs w:val="28"/>
+        </w:rPr>
+        <w:t xml:space="preserve"> (дата по возрастанию, ФИО по убыванию). </w:t>
+      </w:r>
+      <w:r>
+        <w:rPr>
+          <w:bCs/>
+          <w:sz w:val="28"/>
+          <w:szCs w:val="28"/>
+        </w:rPr>
+        <w:t>Данные в выходном файле должны быть представлены в табличном виде, первый и второй столбец должны содержать значения ключей в соответствии с заданным порядком сортировки, третий столбец - номер строки входного файла.</w:t>
       </w:r>
     </w:p>
     <w:p>
@@ -1975,7 +1991,6 @@
           <w:bCs/>
           <w:sz w:val="28"/>
           <w:szCs w:val="28"/>
-          <w:lang w:val="en-US"/>
         </w:rPr>
       </w:pPr>
       <w:r>
@@ -2015,6 +2030,7 @@
           <w:bCs/>
           <w:sz w:val="28"/>
           <w:szCs w:val="28"/>
+          <w:lang w:val="en-US"/>
         </w:rPr>
       </w:pPr>
       <w:r>
@@ -2040,25 +2056,6 @@
           <w:szCs w:val="28"/>
         </w:rPr>
         <w:br/>
-        <w:t xml:space="preserve">Реализация использует обобщённый тип T, реализующий интерфейс </w:t>
-      </w:r>
-      <w:proofErr w:type="spellStart"/>
-      <w:r>
-        <w:rPr>
-          <w:bCs/>
-          <w:sz w:val="28"/>
-          <w:szCs w:val="28"/>
-        </w:rPr>
-        <w:t>IComparable</w:t>
-      </w:r>
-      <w:proofErr w:type="spellEnd"/>
-      <w:r>
-        <w:rPr>
-          <w:bCs/>
-          <w:sz w:val="28"/>
-          <w:szCs w:val="28"/>
-        </w:rPr>
-        <w:t>&lt;T&gt;, что позволяет сортировать любые сравнимые объекты.</w:t>
       </w:r>
     </w:p>
     <w:p>
@@ -2068,47 +2065,108 @@
           <w:bCs/>
           <w:sz w:val="28"/>
           <w:szCs w:val="28"/>
-        </w:rPr>
-      </w:pPr>
+          <w:lang w:val="en-US"/>
+        </w:rPr>
+      </w:pPr>
+      <w:r>
+        <w:rPr>
+          <w:b/>
+          <w:sz w:val="28"/>
+          <w:szCs w:val="28"/>
+        </w:rPr>
+        <w:t>Псевдокод</w:t>
+      </w:r>
+      <w:r>
+        <w:rPr>
+          <w:bCs/>
+          <w:sz w:val="28"/>
+          <w:szCs w:val="28"/>
+          <w:lang w:val="en-US"/>
+        </w:rPr>
+        <w:t>:</w:t>
+      </w:r>
     </w:p>
     <w:p>
       <w:pPr>
         <w:spacing w:line="360" w:lineRule="auto"/>
         <w:rPr>
-          <w:b/>
-          <w:bCs/>
-          <w:sz w:val="28"/>
-          <w:szCs w:val="28"/>
-        </w:rPr>
-      </w:pPr>
-      <w:r>
-        <w:rPr>
-          <w:b/>
-          <w:bCs/>
-          <w:sz w:val="28"/>
-          <w:szCs w:val="28"/>
-        </w:rPr>
-        <w:t>Естественная сортировка слиянием (</w:t>
-      </w:r>
-      <w:proofErr w:type="spellStart"/>
-      <w:r>
-        <w:rPr>
-          <w:b/>
-          <w:bCs/>
-          <w:sz w:val="28"/>
-          <w:szCs w:val="28"/>
-        </w:rPr>
-        <w:t>NaturalMergeSort</w:t>
-      </w:r>
-      <w:proofErr w:type="spellEnd"/>
-      <w:r>
-        <w:rPr>
-          <w:b/>
-          <w:bCs/>
-          <w:sz w:val="28"/>
-          <w:szCs w:val="28"/>
-        </w:rPr>
-        <w:t>)</w:t>
+          <w:bCs/>
+          <w:sz w:val="28"/>
+          <w:szCs w:val="28"/>
+          <w:lang w:val="en-US"/>
+        </w:rPr>
+      </w:pPr>
+      <w:r>
+        <w:rPr>
+          <w:bCs/>
+          <w:sz w:val="28"/>
+          <w:szCs w:val="28"/>
+        </w:rPr>
+        <w:t>ф</w:t>
+      </w:r>
+      <w:r>
+        <w:rPr>
+          <w:bCs/>
+          <w:sz w:val="28"/>
+          <w:szCs w:val="28"/>
+        </w:rPr>
+        <w:t>ункция</w:t>
+      </w:r>
+      <w:r>
+        <w:rPr>
+          <w:bCs/>
+          <w:sz w:val="28"/>
+          <w:szCs w:val="28"/>
+          <w:lang w:val="en-US"/>
+        </w:rPr>
+        <w:t xml:space="preserve"> </w:t>
+      </w:r>
+      <w:proofErr w:type="spellStart"/>
+      <w:proofErr w:type="gramStart"/>
+      <w:r>
+        <w:rPr>
+          <w:bCs/>
+          <w:sz w:val="28"/>
+          <w:szCs w:val="28"/>
+          <w:lang w:val="en-US"/>
+        </w:rPr>
+        <w:t>InsertionSort</w:t>
+      </w:r>
+      <w:proofErr w:type="spellEnd"/>
+      <w:r>
+        <w:rPr>
+          <w:bCs/>
+          <w:sz w:val="28"/>
+          <w:szCs w:val="28"/>
+          <w:lang w:val="en-US"/>
+        </w:rPr>
+        <w:t>(</w:t>
+      </w:r>
+      <w:proofErr w:type="gramEnd"/>
+      <w:r>
+        <w:rPr>
+          <w:bCs/>
+          <w:sz w:val="28"/>
+          <w:szCs w:val="28"/>
+        </w:rPr>
+        <w:t>м</w:t>
+      </w:r>
+      <w:r>
+        <w:rPr>
+          <w:bCs/>
+          <w:sz w:val="28"/>
+          <w:szCs w:val="28"/>
+        </w:rPr>
+        <w:t>ассив</w:t>
+      </w:r>
+      <w:r>
+        <w:rPr>
+          <w:bCs/>
+          <w:sz w:val="28"/>
+          <w:szCs w:val="28"/>
+          <w:lang w:val="en-US"/>
+        </w:rPr>
+        <w:t xml:space="preserve"> A)</w:t>
       </w:r>
     </w:p>
     <w:p>
@@ -2125,8 +2183,41 @@
           <w:bCs/>
           <w:sz w:val="28"/>
           <w:szCs w:val="28"/>
-        </w:rPr>
-        <w:t>Алгоритм автоматически определяет уже отсортированные</w:t>
+          <w:lang w:val="en-US"/>
+        </w:rPr>
+        <w:t xml:space="preserve">    </w:t>
+      </w:r>
+      <w:r>
+        <w:rPr>
+          <w:bCs/>
+          <w:sz w:val="28"/>
+          <w:szCs w:val="28"/>
+        </w:rPr>
+        <w:t>д</w:t>
+      </w:r>
+      <w:r>
+        <w:rPr>
+          <w:bCs/>
+          <w:sz w:val="28"/>
+          <w:szCs w:val="28"/>
+        </w:rPr>
+        <w:t xml:space="preserve">ля i от 1 до </w:t>
+      </w:r>
+      <w:r>
+        <w:rPr>
+          <w:bCs/>
+          <w:sz w:val="28"/>
+          <w:szCs w:val="28"/>
+        </w:rPr>
+        <w:t>д</w:t>
+      </w:r>
+      <w:r>
+        <w:rPr>
+          <w:bCs/>
+          <w:sz w:val="28"/>
+          <w:szCs w:val="28"/>
+        </w:rPr>
+        <w:t>лина(A)</w:t>
       </w:r>
       <w:r>
         <w:rPr>
@@ -2142,15 +2233,7 @@
           <w:sz w:val="28"/>
           <w:szCs w:val="28"/>
         </w:rPr>
-        <w:t>«пробеги</w:t>
-      </w:r>
-      <w:r>
-        <w:rPr>
-          <w:bCs/>
-          <w:sz w:val="28"/>
-          <w:szCs w:val="28"/>
-        </w:rPr>
-        <w:t>»</w:t>
+        <w:t>-</w:t>
       </w:r>
       <w:r>
         <w:rPr>
@@ -2166,7 +2249,7 @@
           <w:sz w:val="28"/>
           <w:szCs w:val="28"/>
         </w:rPr>
-        <w:t>в массиве и сливает их попарно, пока весь массив не станет отсортированным.</w:t>
+        <w:t>1</w:t>
       </w:r>
     </w:p>
     <w:p>
@@ -2176,15 +2259,61 @@
           <w:bCs/>
           <w:sz w:val="28"/>
           <w:szCs w:val="28"/>
-        </w:rPr>
-      </w:pPr>
-      <w:r>
-        <w:rPr>
-          <w:bCs/>
-          <w:sz w:val="28"/>
-          <w:szCs w:val="28"/>
-        </w:rPr>
-        <w:t>Для хранения отсортированных частей используется дополнительный массив</w:t>
+          <w:lang w:val="en-US"/>
+        </w:rPr>
+      </w:pPr>
+      <w:r>
+        <w:rPr>
+          <w:bCs/>
+          <w:sz w:val="28"/>
+          <w:szCs w:val="28"/>
+        </w:rPr>
+        <w:t xml:space="preserve">        </w:t>
+      </w:r>
+      <w:r>
+        <w:rPr>
+          <w:bCs/>
+          <w:sz w:val="28"/>
+          <w:szCs w:val="28"/>
+        </w:rPr>
+        <w:t>к</w:t>
+      </w:r>
+      <w:r>
+        <w:rPr>
+          <w:bCs/>
+          <w:sz w:val="28"/>
+          <w:szCs w:val="28"/>
+        </w:rPr>
+        <w:t>люч</w:t>
+      </w:r>
+      <w:r>
+        <w:rPr>
+          <w:bCs/>
+          <w:sz w:val="28"/>
+          <w:szCs w:val="28"/>
+          <w:lang w:val="en-US"/>
+        </w:rPr>
+        <w:t xml:space="preserve"> = A[</w:t>
+      </w:r>
+      <w:proofErr w:type="spellStart"/>
+      <w:r>
+        <w:rPr>
+          <w:bCs/>
+          <w:sz w:val="28"/>
+          <w:szCs w:val="28"/>
+          <w:lang w:val="en-US"/>
+        </w:rPr>
+        <w:t>i</w:t>
+      </w:r>
+      <w:proofErr w:type="spellEnd"/>
+      <w:r>
+        <w:rPr>
+          <w:bCs/>
+          <w:sz w:val="28"/>
+          <w:szCs w:val="28"/>
+          <w:lang w:val="en-US"/>
+        </w:rPr>
+        <w:t>]</w:t>
       </w:r>
     </w:p>
     <w:p>
@@ -2194,33 +2323,17 @@
           <w:bCs/>
           <w:sz w:val="28"/>
           <w:szCs w:val="28"/>
-        </w:rPr>
-      </w:pPr>
-      <w:r>
-        <w:rPr>
-          <w:bCs/>
-          <w:sz w:val="28"/>
-          <w:szCs w:val="28"/>
-        </w:rPr>
-        <w:t xml:space="preserve">Реализация использует обобщённый тип T, реализующий интерфейс </w:t>
-      </w:r>
-      <w:proofErr w:type="spellStart"/>
-      <w:r>
-        <w:rPr>
-          <w:bCs/>
-          <w:sz w:val="28"/>
-          <w:szCs w:val="28"/>
-        </w:rPr>
-        <w:t>IComparable</w:t>
-      </w:r>
-      <w:proofErr w:type="spellEnd"/>
-      <w:r>
-        <w:rPr>
-          <w:bCs/>
-          <w:sz w:val="28"/>
-          <w:szCs w:val="28"/>
-        </w:rPr>
-        <w:t>&lt;T&gt;, что позволяет сортировать любые сравнимые объекты.</w:t>
+          <w:lang w:val="en-US"/>
+        </w:rPr>
+      </w:pPr>
+      <w:r>
+        <w:rPr>
+          <w:bCs/>
+          <w:sz w:val="28"/>
+          <w:szCs w:val="28"/>
+          <w:lang w:val="en-US"/>
+        </w:rPr>
+        <w:t xml:space="preserve">        j = i - 1</w:t>
       </w:r>
     </w:p>
     <w:p>
@@ -2230,8 +2343,18 @@
           <w:bCs/>
           <w:sz w:val="28"/>
           <w:szCs w:val="28"/>
-        </w:rPr>
-      </w:pPr>
+          <w:lang w:val="en-US"/>
+        </w:rPr>
+      </w:pPr>
+      <w:r>
+        <w:rPr>
+          <w:bCs/>
+          <w:sz w:val="28"/>
+          <w:szCs w:val="28"/>
+          <w:lang w:val="en-US"/>
+        </w:rPr>
+        <w:t xml:space="preserve">        </w:t>
+      </w:r>
     </w:p>
     <w:p>
       <w:pPr>
@@ -2248,12 +2371,1777 @@
           <w:sz w:val="28"/>
           <w:szCs w:val="28"/>
         </w:rPr>
-        <w:br w:type="page"/>
+        <w:t xml:space="preserve">        </w:t>
+      </w:r>
+      <w:r>
+        <w:rPr>
+          <w:bCs/>
+          <w:sz w:val="28"/>
+          <w:szCs w:val="28"/>
+        </w:rPr>
+        <w:t>п</w:t>
+      </w:r>
+      <w:r>
+        <w:rPr>
+          <w:bCs/>
+          <w:sz w:val="28"/>
+          <w:szCs w:val="28"/>
+        </w:rPr>
+        <w:t xml:space="preserve">ока </w:t>
+      </w:r>
+      <w:proofErr w:type="gramStart"/>
+      <w:r>
+        <w:rPr>
+          <w:bCs/>
+          <w:sz w:val="28"/>
+          <w:szCs w:val="28"/>
+          <w:lang w:val="en-US"/>
+        </w:rPr>
+        <w:t>j</w:t>
+      </w:r>
+      <w:r>
+        <w:rPr>
+          <w:bCs/>
+          <w:sz w:val="28"/>
+          <w:szCs w:val="28"/>
+        </w:rPr>
+        <w:t xml:space="preserve"> &gt;</w:t>
+      </w:r>
+      <w:proofErr w:type="gramEnd"/>
+      <w:r>
+        <w:rPr>
+          <w:bCs/>
+          <w:sz w:val="28"/>
+          <w:szCs w:val="28"/>
+        </w:rPr>
+        <w:t xml:space="preserve">= 0 </w:t>
+      </w:r>
+      <w:r>
+        <w:rPr>
+          <w:bCs/>
+          <w:sz w:val="28"/>
+          <w:szCs w:val="28"/>
+        </w:rPr>
+        <w:t>и</w:t>
+      </w:r>
+      <w:r>
+        <w:rPr>
+          <w:bCs/>
+          <w:sz w:val="28"/>
+          <w:szCs w:val="28"/>
+        </w:rPr>
+        <w:t xml:space="preserve"> </w:t>
+      </w:r>
+      <w:r>
+        <w:rPr>
+          <w:bCs/>
+          <w:sz w:val="28"/>
+          <w:szCs w:val="28"/>
+          <w:lang w:val="en-US"/>
+        </w:rPr>
+        <w:t>A</w:t>
+      </w:r>
+      <w:r>
+        <w:rPr>
+          <w:bCs/>
+          <w:sz w:val="28"/>
+          <w:szCs w:val="28"/>
+        </w:rPr>
+        <w:t>[</w:t>
+      </w:r>
+      <w:r>
+        <w:rPr>
+          <w:bCs/>
+          <w:sz w:val="28"/>
+          <w:szCs w:val="28"/>
+          <w:lang w:val="en-US"/>
+        </w:rPr>
+        <w:t>j</w:t>
+      </w:r>
+      <w:proofErr w:type="gramStart"/>
+      <w:r>
+        <w:rPr>
+          <w:bCs/>
+          <w:sz w:val="28"/>
+          <w:szCs w:val="28"/>
+        </w:rPr>
+        <w:t>] &gt;</w:t>
+      </w:r>
+      <w:proofErr w:type="gramEnd"/>
+      <w:r>
+        <w:rPr>
+          <w:bCs/>
+          <w:sz w:val="28"/>
+          <w:szCs w:val="28"/>
+        </w:rPr>
+        <w:t xml:space="preserve"> </w:t>
+      </w:r>
+      <w:r>
+        <w:rPr>
+          <w:bCs/>
+          <w:sz w:val="28"/>
+          <w:szCs w:val="28"/>
+        </w:rPr>
+        <w:t>к</w:t>
+      </w:r>
+      <w:r>
+        <w:rPr>
+          <w:bCs/>
+          <w:sz w:val="28"/>
+          <w:szCs w:val="28"/>
+        </w:rPr>
+        <w:t>люч</w:t>
       </w:r>
     </w:p>
     <w:p>
       <w:pPr>
         <w:spacing w:line="360" w:lineRule="auto"/>
+        <w:rPr>
+          <w:bCs/>
+          <w:sz w:val="28"/>
+          <w:szCs w:val="28"/>
+          <w:lang w:val="en-US"/>
+        </w:rPr>
+      </w:pPr>
+      <w:r>
+        <w:rPr>
+          <w:bCs/>
+          <w:sz w:val="28"/>
+          <w:szCs w:val="28"/>
+        </w:rPr>
+        <w:t xml:space="preserve">            </w:t>
+      </w:r>
+      <w:proofErr w:type="gramStart"/>
+      <w:r>
+        <w:rPr>
+          <w:bCs/>
+          <w:sz w:val="28"/>
+          <w:szCs w:val="28"/>
+          <w:lang w:val="en-US"/>
+        </w:rPr>
+        <w:t>A[</w:t>
+      </w:r>
+      <w:proofErr w:type="gramEnd"/>
+      <w:r>
+        <w:rPr>
+          <w:bCs/>
+          <w:sz w:val="28"/>
+          <w:szCs w:val="28"/>
+          <w:lang w:val="en-US"/>
+        </w:rPr>
+        <w:t>j + 1] = A[j]</w:t>
+      </w:r>
+    </w:p>
+    <w:p>
+      <w:pPr>
+        <w:spacing w:line="360" w:lineRule="auto"/>
+        <w:rPr>
+          <w:bCs/>
+          <w:sz w:val="28"/>
+          <w:szCs w:val="28"/>
+          <w:lang w:val="en-US"/>
+        </w:rPr>
+      </w:pPr>
+      <w:r>
+        <w:rPr>
+          <w:bCs/>
+          <w:sz w:val="28"/>
+          <w:szCs w:val="28"/>
+          <w:lang w:val="en-US"/>
+        </w:rPr>
+        <w:t xml:space="preserve">            j = j - 1</w:t>
+      </w:r>
+    </w:p>
+    <w:p>
+      <w:pPr>
+        <w:spacing w:line="360" w:lineRule="auto"/>
+        <w:rPr>
+          <w:bCs/>
+          <w:sz w:val="28"/>
+          <w:szCs w:val="28"/>
+        </w:rPr>
+      </w:pPr>
+      <w:r>
+        <w:rPr>
+          <w:bCs/>
+          <w:sz w:val="28"/>
+          <w:szCs w:val="28"/>
+        </w:rPr>
+        <w:t xml:space="preserve">        </w:t>
+      </w:r>
+      <w:r>
+        <w:rPr>
+          <w:bCs/>
+          <w:sz w:val="28"/>
+          <w:szCs w:val="28"/>
+        </w:rPr>
+        <w:t>конец</w:t>
+      </w:r>
+      <w:r>
+        <w:rPr>
+          <w:bCs/>
+          <w:sz w:val="28"/>
+          <w:szCs w:val="28"/>
+        </w:rPr>
+        <w:t xml:space="preserve"> </w:t>
+      </w:r>
+      <w:r>
+        <w:rPr>
+          <w:bCs/>
+          <w:sz w:val="28"/>
+          <w:szCs w:val="28"/>
+        </w:rPr>
+        <w:t>п</w:t>
+      </w:r>
+      <w:r>
+        <w:rPr>
+          <w:bCs/>
+          <w:sz w:val="28"/>
+          <w:szCs w:val="28"/>
+        </w:rPr>
+        <w:t>ока</w:t>
+      </w:r>
+    </w:p>
+    <w:p>
+      <w:pPr>
+        <w:spacing w:line="360" w:lineRule="auto"/>
+        <w:rPr>
+          <w:bCs/>
+          <w:sz w:val="28"/>
+          <w:szCs w:val="28"/>
+        </w:rPr>
+      </w:pPr>
+      <w:r>
+        <w:rPr>
+          <w:bCs/>
+          <w:sz w:val="28"/>
+          <w:szCs w:val="28"/>
+        </w:rPr>
+        <w:t xml:space="preserve">        </w:t>
+      </w:r>
+    </w:p>
+    <w:p>
+      <w:pPr>
+        <w:spacing w:line="360" w:lineRule="auto"/>
+        <w:rPr>
+          <w:bCs/>
+          <w:sz w:val="28"/>
+          <w:szCs w:val="28"/>
+        </w:rPr>
+      </w:pPr>
+      <w:r>
+        <w:rPr>
+          <w:bCs/>
+          <w:sz w:val="28"/>
+          <w:szCs w:val="28"/>
+        </w:rPr>
+        <w:t xml:space="preserve">        </w:t>
+      </w:r>
+      <w:proofErr w:type="gramStart"/>
+      <w:r>
+        <w:rPr>
+          <w:bCs/>
+          <w:sz w:val="28"/>
+          <w:szCs w:val="28"/>
+          <w:lang w:val="en-US"/>
+        </w:rPr>
+        <w:t>A</w:t>
+      </w:r>
+      <w:r>
+        <w:rPr>
+          <w:bCs/>
+          <w:sz w:val="28"/>
+          <w:szCs w:val="28"/>
+        </w:rPr>
+        <w:t>[</w:t>
+      </w:r>
+      <w:proofErr w:type="gramEnd"/>
+      <w:r>
+        <w:rPr>
+          <w:bCs/>
+          <w:sz w:val="28"/>
+          <w:szCs w:val="28"/>
+          <w:lang w:val="en-US"/>
+        </w:rPr>
+        <w:t>j</w:t>
+      </w:r>
+      <w:r>
+        <w:rPr>
+          <w:bCs/>
+          <w:sz w:val="28"/>
+          <w:szCs w:val="28"/>
+        </w:rPr>
+        <w:t xml:space="preserve"> + 1] = </w:t>
+      </w:r>
+      <w:r>
+        <w:rPr>
+          <w:bCs/>
+          <w:sz w:val="28"/>
+          <w:szCs w:val="28"/>
+        </w:rPr>
+        <w:t>к</w:t>
+      </w:r>
+      <w:r>
+        <w:rPr>
+          <w:bCs/>
+          <w:sz w:val="28"/>
+          <w:szCs w:val="28"/>
+        </w:rPr>
+        <w:t>люч</w:t>
+      </w:r>
+    </w:p>
+    <w:p>
+      <w:pPr>
+        <w:spacing w:line="360" w:lineRule="auto"/>
+        <w:rPr>
+          <w:bCs/>
+          <w:sz w:val="28"/>
+          <w:szCs w:val="28"/>
+        </w:rPr>
+      </w:pPr>
+      <w:r>
+        <w:rPr>
+          <w:bCs/>
+          <w:sz w:val="28"/>
+          <w:szCs w:val="28"/>
+        </w:rPr>
+        <w:t xml:space="preserve">    </w:t>
+      </w:r>
+      <w:r>
+        <w:rPr>
+          <w:bCs/>
+          <w:sz w:val="28"/>
+          <w:szCs w:val="28"/>
+        </w:rPr>
+        <w:t>конец</w:t>
+      </w:r>
+      <w:r>
+        <w:rPr>
+          <w:bCs/>
+          <w:sz w:val="28"/>
+          <w:szCs w:val="28"/>
+        </w:rPr>
+        <w:t xml:space="preserve"> </w:t>
+      </w:r>
+      <w:r>
+        <w:rPr>
+          <w:bCs/>
+          <w:sz w:val="28"/>
+          <w:szCs w:val="28"/>
+        </w:rPr>
+        <w:t>д</w:t>
+      </w:r>
+      <w:r>
+        <w:rPr>
+          <w:bCs/>
+          <w:sz w:val="28"/>
+          <w:szCs w:val="28"/>
+        </w:rPr>
+        <w:t>ля</w:t>
+      </w:r>
+    </w:p>
+    <w:p>
+      <w:pPr>
+        <w:spacing w:line="360" w:lineRule="auto"/>
+        <w:rPr>
+          <w:bCs/>
+          <w:sz w:val="28"/>
+          <w:szCs w:val="28"/>
+        </w:rPr>
+      </w:pPr>
+      <w:r>
+        <w:rPr>
+          <w:bCs/>
+          <w:sz w:val="28"/>
+          <w:szCs w:val="28"/>
+        </w:rPr>
+        <w:t>конец</w:t>
+      </w:r>
+      <w:r>
+        <w:rPr>
+          <w:bCs/>
+          <w:sz w:val="28"/>
+          <w:szCs w:val="28"/>
+          <w:lang w:val="en-US"/>
+        </w:rPr>
+        <w:t xml:space="preserve"> </w:t>
+      </w:r>
+      <w:r>
+        <w:rPr>
+          <w:bCs/>
+          <w:sz w:val="28"/>
+          <w:szCs w:val="28"/>
+        </w:rPr>
+        <w:t>ф</w:t>
+      </w:r>
+      <w:r>
+        <w:rPr>
+          <w:bCs/>
+          <w:sz w:val="28"/>
+          <w:szCs w:val="28"/>
+        </w:rPr>
+        <w:t>ункции</w:t>
+      </w:r>
+    </w:p>
+    <w:p>
+      <w:pPr>
+        <w:spacing w:line="360" w:lineRule="auto"/>
+        <w:rPr>
+          <w:bCs/>
+          <w:sz w:val="28"/>
+          <w:szCs w:val="28"/>
+        </w:rPr>
+      </w:pPr>
+    </w:p>
+    <w:p>
+      <w:pPr>
+        <w:spacing w:line="360" w:lineRule="auto"/>
+        <w:rPr>
+          <w:bCs/>
+          <w:sz w:val="28"/>
+          <w:szCs w:val="28"/>
+        </w:rPr>
+      </w:pPr>
+    </w:p>
+    <w:p>
+      <w:pPr>
+        <w:spacing w:line="360" w:lineRule="auto"/>
+        <w:rPr>
+          <w:b/>
+          <w:bCs/>
+          <w:sz w:val="28"/>
+          <w:szCs w:val="28"/>
+        </w:rPr>
+      </w:pPr>
+      <w:r>
+        <w:rPr>
+          <w:b/>
+          <w:bCs/>
+          <w:sz w:val="28"/>
+          <w:szCs w:val="28"/>
+        </w:rPr>
+        <w:t>Естественная сортировка слиянием (</w:t>
+      </w:r>
+      <w:proofErr w:type="spellStart"/>
+      <w:r>
+        <w:rPr>
+          <w:b/>
+          <w:bCs/>
+          <w:sz w:val="28"/>
+          <w:szCs w:val="28"/>
+        </w:rPr>
+        <w:t>NaturalMergeSort</w:t>
+      </w:r>
+      <w:proofErr w:type="spellEnd"/>
+      <w:r>
+        <w:rPr>
+          <w:b/>
+          <w:bCs/>
+          <w:sz w:val="28"/>
+          <w:szCs w:val="28"/>
+        </w:rPr>
+        <w:t>)</w:t>
+      </w:r>
+    </w:p>
+    <w:p>
+      <w:pPr>
+        <w:spacing w:line="360" w:lineRule="auto"/>
+        <w:rPr>
+          <w:bCs/>
+          <w:sz w:val="28"/>
+          <w:szCs w:val="28"/>
+        </w:rPr>
+      </w:pPr>
+      <w:r>
+        <w:rPr>
+          <w:bCs/>
+          <w:sz w:val="28"/>
+          <w:szCs w:val="28"/>
+        </w:rPr>
+        <w:t>Алгоритм автоматически определяет уже отсортированные</w:t>
+      </w:r>
+      <w:r>
+        <w:rPr>
+          <w:bCs/>
+          <w:sz w:val="28"/>
+          <w:szCs w:val="28"/>
+        </w:rPr>
+        <w:t xml:space="preserve"> </w:t>
+      </w:r>
+      <w:r>
+        <w:rPr>
+          <w:bCs/>
+          <w:sz w:val="28"/>
+          <w:szCs w:val="28"/>
+        </w:rPr>
+        <w:t>«пробеги</w:t>
+      </w:r>
+      <w:r>
+        <w:rPr>
+          <w:bCs/>
+          <w:sz w:val="28"/>
+          <w:szCs w:val="28"/>
+        </w:rPr>
+        <w:t>»</w:t>
+      </w:r>
+      <w:r>
+        <w:rPr>
+          <w:bCs/>
+          <w:sz w:val="28"/>
+          <w:szCs w:val="28"/>
+        </w:rPr>
+        <w:t xml:space="preserve"> </w:t>
+      </w:r>
+      <w:r>
+        <w:rPr>
+          <w:bCs/>
+          <w:sz w:val="28"/>
+          <w:szCs w:val="28"/>
+        </w:rPr>
+        <w:t>в массиве и сливает их попарно, пока весь массив не станет отсортированным.</w:t>
+      </w:r>
+    </w:p>
+    <w:p>
+      <w:pPr>
+        <w:spacing w:line="360" w:lineRule="auto"/>
+        <w:rPr>
+          <w:bCs/>
+          <w:sz w:val="28"/>
+          <w:szCs w:val="28"/>
+        </w:rPr>
+      </w:pPr>
+      <w:r>
+        <w:rPr>
+          <w:bCs/>
+          <w:sz w:val="28"/>
+          <w:szCs w:val="28"/>
+        </w:rPr>
+        <w:t>Для хранения отсортированных частей используется дополнительный массив</w:t>
+      </w:r>
+    </w:p>
+    <w:p>
+      <w:pPr>
+        <w:spacing w:line="360" w:lineRule="auto"/>
+        <w:rPr>
+          <w:bCs/>
+          <w:sz w:val="28"/>
+          <w:szCs w:val="28"/>
+          <w:lang w:val="en-US"/>
+        </w:rPr>
+      </w:pPr>
+    </w:p>
+    <w:p>
+      <w:pPr>
+        <w:spacing w:line="360" w:lineRule="auto"/>
+        <w:rPr>
+          <w:bCs/>
+          <w:sz w:val="28"/>
+          <w:szCs w:val="28"/>
+          <w:lang w:val="en-US"/>
+        </w:rPr>
+      </w:pPr>
+    </w:p>
+    <w:p>
+      <w:pPr>
+        <w:spacing w:line="360" w:lineRule="auto"/>
+        <w:rPr>
+          <w:bCs/>
+          <w:sz w:val="28"/>
+          <w:szCs w:val="28"/>
+        </w:rPr>
+      </w:pPr>
+    </w:p>
+    <w:p>
+      <w:pPr>
+        <w:spacing w:line="360" w:lineRule="auto"/>
+        <w:rPr>
+          <w:bCs/>
+          <w:sz w:val="28"/>
+          <w:szCs w:val="28"/>
+          <w:lang w:val="en-US"/>
+        </w:rPr>
+      </w:pPr>
+      <w:r>
+        <w:rPr>
+          <w:b/>
+          <w:sz w:val="28"/>
+          <w:szCs w:val="28"/>
+        </w:rPr>
+        <w:lastRenderedPageBreak/>
+        <w:t>Псевдокод</w:t>
+      </w:r>
+      <w:r>
+        <w:rPr>
+          <w:bCs/>
+          <w:sz w:val="28"/>
+          <w:szCs w:val="28"/>
+          <w:lang w:val="en-US"/>
+        </w:rPr>
+        <w:t>:</w:t>
+      </w:r>
+    </w:p>
+    <w:p>
+      <w:pPr>
+        <w:spacing w:line="360" w:lineRule="auto"/>
+        <w:rPr>
+          <w:bCs/>
+          <w:sz w:val="28"/>
+          <w:szCs w:val="28"/>
+        </w:rPr>
+      </w:pPr>
+      <w:r>
+        <w:rPr>
+          <w:bCs/>
+          <w:sz w:val="28"/>
+          <w:szCs w:val="28"/>
+        </w:rPr>
+        <w:t xml:space="preserve">функция </w:t>
+      </w:r>
+      <w:proofErr w:type="spellStart"/>
+      <w:proofErr w:type="gramStart"/>
+      <w:r>
+        <w:rPr>
+          <w:bCs/>
+          <w:sz w:val="28"/>
+          <w:szCs w:val="28"/>
+        </w:rPr>
+        <w:t>naturalMergeSort</w:t>
+      </w:r>
+      <w:proofErr w:type="spellEnd"/>
+      <w:r>
+        <w:rPr>
+          <w:bCs/>
+          <w:sz w:val="28"/>
+          <w:szCs w:val="28"/>
+        </w:rPr>
+        <w:t>(</w:t>
+      </w:r>
+      <w:proofErr w:type="gramEnd"/>
+      <w:r>
+        <w:rPr>
+          <w:bCs/>
+          <w:sz w:val="28"/>
+          <w:szCs w:val="28"/>
+        </w:rPr>
+        <w:t>массив a)</w:t>
+      </w:r>
+    </w:p>
+    <w:p>
+      <w:pPr>
+        <w:spacing w:line="360" w:lineRule="auto"/>
+        <w:rPr>
+          <w:bCs/>
+          <w:sz w:val="28"/>
+          <w:szCs w:val="28"/>
+        </w:rPr>
+      </w:pPr>
+      <w:r>
+        <w:rPr>
+          <w:bCs/>
+          <w:sz w:val="28"/>
+          <w:szCs w:val="28"/>
+        </w:rPr>
+        <w:t xml:space="preserve">    если длина(a) &lt;= 1</w:t>
+      </w:r>
+    </w:p>
+    <w:p>
+      <w:pPr>
+        <w:spacing w:line="360" w:lineRule="auto"/>
+        <w:rPr>
+          <w:bCs/>
+          <w:sz w:val="28"/>
+          <w:szCs w:val="28"/>
+        </w:rPr>
+      </w:pPr>
+      <w:r>
+        <w:rPr>
+          <w:bCs/>
+          <w:sz w:val="28"/>
+          <w:szCs w:val="28"/>
+        </w:rPr>
+        <w:t xml:space="preserve">        вернуть a</w:t>
+      </w:r>
+    </w:p>
+    <w:p>
+      <w:pPr>
+        <w:spacing w:line="360" w:lineRule="auto"/>
+        <w:rPr>
+          <w:bCs/>
+          <w:sz w:val="28"/>
+          <w:szCs w:val="28"/>
+        </w:rPr>
+      </w:pPr>
+      <w:r>
+        <w:rPr>
+          <w:bCs/>
+          <w:sz w:val="28"/>
+          <w:szCs w:val="28"/>
+        </w:rPr>
+        <w:t xml:space="preserve">    конец если</w:t>
+      </w:r>
+    </w:p>
+    <w:p>
+      <w:pPr>
+        <w:spacing w:line="360" w:lineRule="auto"/>
+        <w:rPr>
+          <w:bCs/>
+          <w:sz w:val="28"/>
+          <w:szCs w:val="28"/>
+        </w:rPr>
+      </w:pPr>
+      <w:r>
+        <w:rPr>
+          <w:bCs/>
+          <w:sz w:val="28"/>
+          <w:szCs w:val="28"/>
+        </w:rPr>
+        <w:t xml:space="preserve">    </w:t>
+      </w:r>
+    </w:p>
+    <w:p>
+      <w:pPr>
+        <w:spacing w:line="360" w:lineRule="auto"/>
+        <w:rPr>
+          <w:bCs/>
+          <w:sz w:val="28"/>
+          <w:szCs w:val="28"/>
+        </w:rPr>
+      </w:pPr>
+      <w:r>
+        <w:rPr>
+          <w:bCs/>
+          <w:sz w:val="28"/>
+          <w:szCs w:val="28"/>
+        </w:rPr>
+        <w:t xml:space="preserve">    пока массив a не отсортирован</w:t>
+      </w:r>
+    </w:p>
+    <w:p>
+      <w:pPr>
+        <w:spacing w:line="360" w:lineRule="auto"/>
+        <w:rPr>
+          <w:bCs/>
+          <w:sz w:val="28"/>
+          <w:szCs w:val="28"/>
+        </w:rPr>
+      </w:pPr>
+      <w:r>
+        <w:rPr>
+          <w:bCs/>
+          <w:sz w:val="28"/>
+          <w:szCs w:val="28"/>
+        </w:rPr>
+        <w:t xml:space="preserve">        пробеги = </w:t>
+      </w:r>
+      <w:proofErr w:type="spellStart"/>
+      <w:r>
+        <w:rPr>
+          <w:bCs/>
+          <w:sz w:val="28"/>
+          <w:szCs w:val="28"/>
+        </w:rPr>
+        <w:t>найтиПробеги</w:t>
+      </w:r>
+      <w:proofErr w:type="spellEnd"/>
+      <w:r>
+        <w:rPr>
+          <w:bCs/>
+          <w:sz w:val="28"/>
+          <w:szCs w:val="28"/>
+        </w:rPr>
+        <w:t>(a)</w:t>
+      </w:r>
+    </w:p>
+    <w:p>
+      <w:pPr>
+        <w:spacing w:line="360" w:lineRule="auto"/>
+        <w:rPr>
+          <w:bCs/>
+          <w:sz w:val="28"/>
+          <w:szCs w:val="28"/>
+        </w:rPr>
+      </w:pPr>
+      <w:r>
+        <w:rPr>
+          <w:bCs/>
+          <w:sz w:val="28"/>
+          <w:szCs w:val="28"/>
+        </w:rPr>
+        <w:t xml:space="preserve">        </w:t>
+      </w:r>
+      <w:proofErr w:type="spellStart"/>
+      <w:r>
+        <w:rPr>
+          <w:bCs/>
+          <w:sz w:val="28"/>
+          <w:szCs w:val="28"/>
+        </w:rPr>
+        <w:t>новыйМассив</w:t>
+      </w:r>
+      <w:proofErr w:type="spellEnd"/>
+      <w:r>
+        <w:rPr>
+          <w:bCs/>
+          <w:sz w:val="28"/>
+          <w:szCs w:val="28"/>
+        </w:rPr>
+        <w:t xml:space="preserve"> = пустой массив</w:t>
+      </w:r>
+    </w:p>
+    <w:p>
+      <w:pPr>
+        <w:spacing w:line="360" w:lineRule="auto"/>
+        <w:rPr>
+          <w:bCs/>
+          <w:sz w:val="28"/>
+          <w:szCs w:val="28"/>
+        </w:rPr>
+      </w:pPr>
+      <w:r>
+        <w:rPr>
+          <w:bCs/>
+          <w:sz w:val="28"/>
+          <w:szCs w:val="28"/>
+        </w:rPr>
+        <w:t xml:space="preserve">        </w:t>
+      </w:r>
+    </w:p>
+    <w:p>
+      <w:pPr>
+        <w:spacing w:line="360" w:lineRule="auto"/>
+        <w:rPr>
+          <w:bCs/>
+          <w:sz w:val="28"/>
+          <w:szCs w:val="28"/>
+        </w:rPr>
+      </w:pPr>
+      <w:r>
+        <w:rPr>
+          <w:bCs/>
+          <w:sz w:val="28"/>
+          <w:szCs w:val="28"/>
+        </w:rPr>
+        <w:t xml:space="preserve">        для каждой пары пробегов (левый, правый)</w:t>
+      </w:r>
+    </w:p>
+    <w:p>
+      <w:pPr>
+        <w:spacing w:line="360" w:lineRule="auto"/>
+        <w:rPr>
+          <w:bCs/>
+          <w:sz w:val="28"/>
+          <w:szCs w:val="28"/>
+        </w:rPr>
+      </w:pPr>
+      <w:r>
+        <w:rPr>
+          <w:bCs/>
+          <w:sz w:val="28"/>
+          <w:szCs w:val="28"/>
+        </w:rPr>
+        <w:t xml:space="preserve">            объединить левый и правый в </w:t>
+      </w:r>
+      <w:proofErr w:type="spellStart"/>
+      <w:r>
+        <w:rPr>
+          <w:bCs/>
+          <w:sz w:val="28"/>
+          <w:szCs w:val="28"/>
+        </w:rPr>
+        <w:t>новыйМассив</w:t>
+      </w:r>
+      <w:proofErr w:type="spellEnd"/>
+      <w:r>
+        <w:rPr>
+          <w:bCs/>
+          <w:sz w:val="28"/>
+          <w:szCs w:val="28"/>
+        </w:rPr>
+        <w:t xml:space="preserve"> с помощью </w:t>
+      </w:r>
+      <w:proofErr w:type="spellStart"/>
+      <w:r>
+        <w:rPr>
+          <w:bCs/>
+          <w:sz w:val="28"/>
+          <w:szCs w:val="28"/>
+        </w:rPr>
+        <w:t>merge</w:t>
+      </w:r>
+      <w:proofErr w:type="spellEnd"/>
+    </w:p>
+    <w:p>
+      <w:pPr>
+        <w:spacing w:line="360" w:lineRule="auto"/>
+        <w:rPr>
+          <w:bCs/>
+          <w:sz w:val="28"/>
+          <w:szCs w:val="28"/>
+        </w:rPr>
+      </w:pPr>
+      <w:r>
+        <w:rPr>
+          <w:bCs/>
+          <w:sz w:val="28"/>
+          <w:szCs w:val="28"/>
+        </w:rPr>
+        <w:t xml:space="preserve">        конец для</w:t>
+      </w:r>
+    </w:p>
+    <w:p>
+      <w:pPr>
+        <w:spacing w:line="360" w:lineRule="auto"/>
+        <w:rPr>
+          <w:bCs/>
+          <w:sz w:val="28"/>
+          <w:szCs w:val="28"/>
+        </w:rPr>
+      </w:pPr>
+      <w:r>
+        <w:rPr>
+          <w:bCs/>
+          <w:sz w:val="28"/>
+          <w:szCs w:val="28"/>
+        </w:rPr>
+        <w:t xml:space="preserve">        </w:t>
+      </w:r>
+    </w:p>
+    <w:p>
+      <w:pPr>
+        <w:spacing w:line="360" w:lineRule="auto"/>
+        <w:rPr>
+          <w:bCs/>
+          <w:sz w:val="28"/>
+          <w:szCs w:val="28"/>
+        </w:rPr>
+      </w:pPr>
+      <w:r>
+        <w:rPr>
+          <w:bCs/>
+          <w:sz w:val="28"/>
+          <w:szCs w:val="28"/>
+        </w:rPr>
+        <w:t xml:space="preserve">        a = </w:t>
+      </w:r>
+      <w:proofErr w:type="spellStart"/>
+      <w:r>
+        <w:rPr>
+          <w:bCs/>
+          <w:sz w:val="28"/>
+          <w:szCs w:val="28"/>
+        </w:rPr>
+        <w:t>новыйМассив</w:t>
+      </w:r>
+      <w:proofErr w:type="spellEnd"/>
+    </w:p>
+    <w:p>
+      <w:pPr>
+        <w:spacing w:line="360" w:lineRule="auto"/>
+        <w:rPr>
+          <w:bCs/>
+          <w:sz w:val="28"/>
+          <w:szCs w:val="28"/>
+        </w:rPr>
+      </w:pPr>
+      <w:r>
+        <w:rPr>
+          <w:bCs/>
+          <w:sz w:val="28"/>
+          <w:szCs w:val="28"/>
+        </w:rPr>
+        <w:t xml:space="preserve">    конец пока</w:t>
+      </w:r>
+    </w:p>
+    <w:p>
+      <w:pPr>
+        <w:spacing w:line="360" w:lineRule="auto"/>
+        <w:rPr>
+          <w:bCs/>
+          <w:sz w:val="28"/>
+          <w:szCs w:val="28"/>
+        </w:rPr>
+      </w:pPr>
+      <w:r>
+        <w:rPr>
+          <w:bCs/>
+          <w:sz w:val="28"/>
+          <w:szCs w:val="28"/>
+        </w:rPr>
+        <w:t xml:space="preserve">    </w:t>
+      </w:r>
+    </w:p>
+    <w:p>
+      <w:pPr>
+        <w:spacing w:line="360" w:lineRule="auto"/>
+        <w:rPr>
+          <w:bCs/>
+          <w:sz w:val="28"/>
+          <w:szCs w:val="28"/>
+        </w:rPr>
+      </w:pPr>
+      <w:r>
+        <w:rPr>
+          <w:bCs/>
+          <w:sz w:val="28"/>
+          <w:szCs w:val="28"/>
+        </w:rPr>
+        <w:t xml:space="preserve">    вернуть a</w:t>
+      </w:r>
+    </w:p>
+    <w:p>
+      <w:pPr>
+        <w:spacing w:line="360" w:lineRule="auto"/>
+        <w:rPr>
+          <w:bCs/>
+          <w:sz w:val="28"/>
+          <w:szCs w:val="28"/>
+        </w:rPr>
+      </w:pPr>
+      <w:r>
+        <w:rPr>
+          <w:bCs/>
+          <w:sz w:val="28"/>
+          <w:szCs w:val="28"/>
+        </w:rPr>
+        <w:t>конец функции</w:t>
+      </w:r>
+    </w:p>
+    <w:p>
+      <w:pPr>
+        <w:spacing w:line="360" w:lineRule="auto"/>
+        <w:rPr>
+          <w:bCs/>
+          <w:sz w:val="28"/>
+          <w:szCs w:val="28"/>
+        </w:rPr>
+      </w:pPr>
+    </w:p>
+    <w:p>
+      <w:pPr>
+        <w:spacing w:line="360" w:lineRule="auto"/>
+        <w:rPr>
+          <w:bCs/>
+          <w:sz w:val="28"/>
+          <w:szCs w:val="28"/>
+        </w:rPr>
+      </w:pPr>
+      <w:r>
+        <w:rPr>
+          <w:bCs/>
+          <w:sz w:val="28"/>
+          <w:szCs w:val="28"/>
+        </w:rPr>
+        <w:t xml:space="preserve">функция </w:t>
+      </w:r>
+      <w:proofErr w:type="spellStart"/>
+      <w:proofErr w:type="gramStart"/>
+      <w:r>
+        <w:rPr>
+          <w:bCs/>
+          <w:sz w:val="28"/>
+          <w:szCs w:val="28"/>
+        </w:rPr>
+        <w:t>найтиПробеги</w:t>
+      </w:r>
+      <w:proofErr w:type="spellEnd"/>
+      <w:r>
+        <w:rPr>
+          <w:bCs/>
+          <w:sz w:val="28"/>
+          <w:szCs w:val="28"/>
+        </w:rPr>
+        <w:t>(</w:t>
+      </w:r>
+      <w:proofErr w:type="gramEnd"/>
+      <w:r>
+        <w:rPr>
+          <w:bCs/>
+          <w:sz w:val="28"/>
+          <w:szCs w:val="28"/>
+        </w:rPr>
+        <w:t>массив a)</w:t>
+      </w:r>
+    </w:p>
+    <w:p>
+      <w:pPr>
+        <w:spacing w:line="360" w:lineRule="auto"/>
+        <w:rPr>
+          <w:bCs/>
+          <w:sz w:val="28"/>
+          <w:szCs w:val="28"/>
+        </w:rPr>
+      </w:pPr>
+      <w:r>
+        <w:rPr>
+          <w:bCs/>
+          <w:sz w:val="28"/>
+          <w:szCs w:val="28"/>
+        </w:rPr>
+        <w:t xml:space="preserve">    пробеги = пустой список</w:t>
+      </w:r>
+    </w:p>
+    <w:p>
+      <w:pPr>
+        <w:spacing w:line="360" w:lineRule="auto"/>
+        <w:rPr>
+          <w:bCs/>
+          <w:sz w:val="28"/>
+          <w:szCs w:val="28"/>
+        </w:rPr>
+      </w:pPr>
+      <w:r>
+        <w:rPr>
+          <w:bCs/>
+          <w:sz w:val="28"/>
+          <w:szCs w:val="28"/>
+        </w:rPr>
+        <w:t xml:space="preserve">    начало = 0</w:t>
+      </w:r>
+    </w:p>
+    <w:p>
+      <w:pPr>
+        <w:spacing w:line="360" w:lineRule="auto"/>
+        <w:rPr>
+          <w:bCs/>
+          <w:sz w:val="28"/>
+          <w:szCs w:val="28"/>
+        </w:rPr>
+      </w:pPr>
+      <w:r>
+        <w:rPr>
+          <w:bCs/>
+          <w:sz w:val="28"/>
+          <w:szCs w:val="28"/>
+        </w:rPr>
+        <w:t xml:space="preserve">    для i от 1 до длина(a)</w:t>
+      </w:r>
+    </w:p>
+    <w:p>
+      <w:pPr>
+        <w:spacing w:line="360" w:lineRule="auto"/>
+        <w:rPr>
+          <w:bCs/>
+          <w:sz w:val="28"/>
+          <w:szCs w:val="28"/>
+        </w:rPr>
+      </w:pPr>
+      <w:r>
+        <w:rPr>
+          <w:bCs/>
+          <w:sz w:val="28"/>
+          <w:szCs w:val="28"/>
+        </w:rPr>
+        <w:t xml:space="preserve">        если a[i] </w:t>
+      </w:r>
+      <w:proofErr w:type="gramStart"/>
+      <w:r>
+        <w:rPr>
+          <w:bCs/>
+          <w:sz w:val="28"/>
+          <w:szCs w:val="28"/>
+        </w:rPr>
+        <w:t>&lt; a</w:t>
+      </w:r>
+      <w:proofErr w:type="gramEnd"/>
+      <w:r>
+        <w:rPr>
+          <w:bCs/>
+          <w:sz w:val="28"/>
+          <w:szCs w:val="28"/>
+        </w:rPr>
+        <w:t>[i-1]</w:t>
+      </w:r>
+    </w:p>
+    <w:p>
+      <w:pPr>
+        <w:spacing w:line="360" w:lineRule="auto"/>
+        <w:rPr>
+          <w:bCs/>
+          <w:sz w:val="28"/>
+          <w:szCs w:val="28"/>
+        </w:rPr>
+      </w:pPr>
+      <w:r>
+        <w:rPr>
+          <w:bCs/>
+          <w:sz w:val="28"/>
+          <w:szCs w:val="28"/>
+        </w:rPr>
+        <w:t xml:space="preserve">            добавить пробег(a[</w:t>
+      </w:r>
+      <w:proofErr w:type="gramStart"/>
+      <w:r>
+        <w:rPr>
+          <w:bCs/>
+          <w:sz w:val="28"/>
+          <w:szCs w:val="28"/>
+        </w:rPr>
+        <w:t>начало..</w:t>
+      </w:r>
+      <w:proofErr w:type="gramEnd"/>
+      <w:r>
+        <w:rPr>
+          <w:bCs/>
+          <w:sz w:val="28"/>
+          <w:szCs w:val="28"/>
+        </w:rPr>
+        <w:t>i-1]) в пробеги</w:t>
+      </w:r>
+    </w:p>
+    <w:p>
+      <w:pPr>
+        <w:spacing w:line="360" w:lineRule="auto"/>
+        <w:rPr>
+          <w:bCs/>
+          <w:sz w:val="28"/>
+          <w:szCs w:val="28"/>
+        </w:rPr>
+      </w:pPr>
+      <w:r>
+        <w:rPr>
+          <w:bCs/>
+          <w:sz w:val="28"/>
+          <w:szCs w:val="28"/>
+        </w:rPr>
+        <w:t xml:space="preserve">            начало = i</w:t>
+      </w:r>
+    </w:p>
+    <w:p>
+      <w:pPr>
+        <w:spacing w:line="360" w:lineRule="auto"/>
+        <w:rPr>
+          <w:bCs/>
+          <w:sz w:val="28"/>
+          <w:szCs w:val="28"/>
+        </w:rPr>
+      </w:pPr>
+      <w:r>
+        <w:rPr>
+          <w:bCs/>
+          <w:sz w:val="28"/>
+          <w:szCs w:val="28"/>
+        </w:rPr>
+        <w:t xml:space="preserve">        конец если</w:t>
+      </w:r>
+    </w:p>
+    <w:p>
+      <w:pPr>
+        <w:spacing w:line="360" w:lineRule="auto"/>
+        <w:rPr>
+          <w:bCs/>
+          <w:sz w:val="28"/>
+          <w:szCs w:val="28"/>
+        </w:rPr>
+      </w:pPr>
+      <w:r>
+        <w:rPr>
+          <w:bCs/>
+          <w:sz w:val="28"/>
+          <w:szCs w:val="28"/>
+        </w:rPr>
+        <w:t xml:space="preserve">    конец для</w:t>
+      </w:r>
+    </w:p>
+    <w:p>
+      <w:pPr>
+        <w:spacing w:line="360" w:lineRule="auto"/>
+        <w:rPr>
+          <w:bCs/>
+          <w:sz w:val="28"/>
+          <w:szCs w:val="28"/>
+        </w:rPr>
+      </w:pPr>
+      <w:r>
+        <w:rPr>
+          <w:bCs/>
+          <w:sz w:val="28"/>
+          <w:szCs w:val="28"/>
+        </w:rPr>
+        <w:t xml:space="preserve">    добавить пробег(a[</w:t>
+      </w:r>
+      <w:proofErr w:type="spellStart"/>
+      <w:proofErr w:type="gramStart"/>
+      <w:r>
+        <w:rPr>
+          <w:bCs/>
+          <w:sz w:val="28"/>
+          <w:szCs w:val="28"/>
+        </w:rPr>
+        <w:t>начало..</w:t>
+      </w:r>
+      <w:proofErr w:type="gramEnd"/>
+      <w:r>
+        <w:rPr>
+          <w:bCs/>
+          <w:sz w:val="28"/>
+          <w:szCs w:val="28"/>
+        </w:rPr>
+        <w:t>длина</w:t>
+      </w:r>
+      <w:proofErr w:type="spellEnd"/>
+      <w:r>
+        <w:rPr>
+          <w:bCs/>
+          <w:sz w:val="28"/>
+          <w:szCs w:val="28"/>
+        </w:rPr>
+        <w:t>(a)-1]) в пробеги</w:t>
+      </w:r>
+    </w:p>
+    <w:p>
+      <w:pPr>
+        <w:spacing w:line="360" w:lineRule="auto"/>
+        <w:rPr>
+          <w:bCs/>
+          <w:sz w:val="28"/>
+          <w:szCs w:val="28"/>
+        </w:rPr>
+      </w:pPr>
+      <w:r>
+        <w:rPr>
+          <w:bCs/>
+          <w:sz w:val="28"/>
+          <w:szCs w:val="28"/>
+        </w:rPr>
+        <w:lastRenderedPageBreak/>
+        <w:t xml:space="preserve">    вернуть пробеги</w:t>
+      </w:r>
+    </w:p>
+    <w:p>
+      <w:pPr>
+        <w:spacing w:line="360" w:lineRule="auto"/>
+        <w:rPr>
+          <w:bCs/>
+          <w:sz w:val="28"/>
+          <w:szCs w:val="28"/>
+        </w:rPr>
+      </w:pPr>
+      <w:r>
+        <w:rPr>
+          <w:bCs/>
+          <w:sz w:val="28"/>
+          <w:szCs w:val="28"/>
+        </w:rPr>
+        <w:t>конец функции</w:t>
+      </w:r>
+    </w:p>
+    <w:p>
+      <w:pPr>
+        <w:spacing w:line="360" w:lineRule="auto"/>
+        <w:rPr>
+          <w:bCs/>
+          <w:sz w:val="28"/>
+          <w:szCs w:val="28"/>
+        </w:rPr>
+      </w:pPr>
+    </w:p>
+    <w:p>
+      <w:pPr>
+        <w:spacing w:line="360" w:lineRule="auto"/>
+        <w:rPr>
+          <w:bCs/>
+          <w:sz w:val="28"/>
+          <w:szCs w:val="28"/>
+        </w:rPr>
+      </w:pPr>
+      <w:r>
+        <w:rPr>
+          <w:bCs/>
+          <w:sz w:val="28"/>
+          <w:szCs w:val="28"/>
+        </w:rPr>
+        <w:t xml:space="preserve">функция </w:t>
+      </w:r>
+      <w:proofErr w:type="spellStart"/>
+      <w:proofErr w:type="gramStart"/>
+      <w:r>
+        <w:rPr>
+          <w:bCs/>
+          <w:sz w:val="28"/>
+          <w:szCs w:val="28"/>
+        </w:rPr>
+        <w:t>merge</w:t>
+      </w:r>
+      <w:proofErr w:type="spellEnd"/>
+      <w:r>
+        <w:rPr>
+          <w:bCs/>
+          <w:sz w:val="28"/>
+          <w:szCs w:val="28"/>
+        </w:rPr>
+        <w:t>(</w:t>
+      </w:r>
+      <w:proofErr w:type="gramEnd"/>
+      <w:r>
+        <w:rPr>
+          <w:bCs/>
+          <w:sz w:val="28"/>
+          <w:szCs w:val="28"/>
+        </w:rPr>
+        <w:t>массив l, массив r)</w:t>
+      </w:r>
+    </w:p>
+    <w:p>
+      <w:pPr>
+        <w:spacing w:line="360" w:lineRule="auto"/>
+        <w:rPr>
+          <w:bCs/>
+          <w:sz w:val="28"/>
+          <w:szCs w:val="28"/>
+        </w:rPr>
+      </w:pPr>
+      <w:r>
+        <w:rPr>
+          <w:bCs/>
+          <w:sz w:val="28"/>
+          <w:szCs w:val="28"/>
+        </w:rPr>
+        <w:t xml:space="preserve">    результат = пустой массив</w:t>
+      </w:r>
+    </w:p>
+    <w:p>
+      <w:pPr>
+        <w:spacing w:line="360" w:lineRule="auto"/>
+        <w:rPr>
+          <w:bCs/>
+          <w:sz w:val="28"/>
+          <w:szCs w:val="28"/>
+        </w:rPr>
+      </w:pPr>
+      <w:r>
+        <w:rPr>
+          <w:bCs/>
+          <w:sz w:val="28"/>
+          <w:szCs w:val="28"/>
+        </w:rPr>
+        <w:t xml:space="preserve">    пока l и r не пусты</w:t>
+      </w:r>
+    </w:p>
+    <w:p>
+      <w:pPr>
+        <w:spacing w:line="360" w:lineRule="auto"/>
+        <w:rPr>
+          <w:bCs/>
+          <w:sz w:val="28"/>
+          <w:szCs w:val="28"/>
+        </w:rPr>
+      </w:pPr>
+      <w:r>
+        <w:rPr>
+          <w:bCs/>
+          <w:sz w:val="28"/>
+          <w:szCs w:val="28"/>
+        </w:rPr>
+        <w:t xml:space="preserve">        если </w:t>
+      </w:r>
+      <w:proofErr w:type="gramStart"/>
+      <w:r>
+        <w:rPr>
+          <w:bCs/>
+          <w:sz w:val="28"/>
+          <w:szCs w:val="28"/>
+        </w:rPr>
+        <w:t>l[</w:t>
+      </w:r>
+      <w:proofErr w:type="gramEnd"/>
+      <w:r>
+        <w:rPr>
+          <w:bCs/>
+          <w:sz w:val="28"/>
+          <w:szCs w:val="28"/>
+        </w:rPr>
+        <w:t xml:space="preserve">0] &lt;= </w:t>
+      </w:r>
+      <w:proofErr w:type="gramStart"/>
+      <w:r>
+        <w:rPr>
+          <w:bCs/>
+          <w:sz w:val="28"/>
+          <w:szCs w:val="28"/>
+        </w:rPr>
+        <w:t>r[</w:t>
+      </w:r>
+      <w:proofErr w:type="gramEnd"/>
+      <w:r>
+        <w:rPr>
+          <w:bCs/>
+          <w:sz w:val="28"/>
+          <w:szCs w:val="28"/>
+        </w:rPr>
+        <w:t>0]</w:t>
+      </w:r>
+    </w:p>
+    <w:p>
+      <w:pPr>
+        <w:spacing w:line="360" w:lineRule="auto"/>
+        <w:rPr>
+          <w:bCs/>
+          <w:sz w:val="28"/>
+          <w:szCs w:val="28"/>
+        </w:rPr>
+      </w:pPr>
+      <w:r>
+        <w:rPr>
+          <w:bCs/>
+          <w:sz w:val="28"/>
+          <w:szCs w:val="28"/>
+        </w:rPr>
+        <w:t xml:space="preserve">            добавить </w:t>
+      </w:r>
+      <w:proofErr w:type="gramStart"/>
+      <w:r>
+        <w:rPr>
+          <w:bCs/>
+          <w:sz w:val="28"/>
+          <w:szCs w:val="28"/>
+        </w:rPr>
+        <w:t>l[</w:t>
+      </w:r>
+      <w:proofErr w:type="gramEnd"/>
+      <w:r>
+        <w:rPr>
+          <w:bCs/>
+          <w:sz w:val="28"/>
+          <w:szCs w:val="28"/>
+        </w:rPr>
+        <w:t>0] в результат</w:t>
+      </w:r>
+    </w:p>
+    <w:p>
+      <w:pPr>
+        <w:spacing w:line="360" w:lineRule="auto"/>
+        <w:rPr>
+          <w:bCs/>
+          <w:sz w:val="28"/>
+          <w:szCs w:val="28"/>
+        </w:rPr>
+      </w:pPr>
+      <w:r>
+        <w:rPr>
+          <w:bCs/>
+          <w:sz w:val="28"/>
+          <w:szCs w:val="28"/>
+        </w:rPr>
+        <w:t xml:space="preserve">            удалить </w:t>
+      </w:r>
+      <w:proofErr w:type="gramStart"/>
+      <w:r>
+        <w:rPr>
+          <w:bCs/>
+          <w:sz w:val="28"/>
+          <w:szCs w:val="28"/>
+        </w:rPr>
+        <w:t>l[</w:t>
+      </w:r>
+      <w:proofErr w:type="gramEnd"/>
+      <w:r>
+        <w:rPr>
+          <w:bCs/>
+          <w:sz w:val="28"/>
+          <w:szCs w:val="28"/>
+        </w:rPr>
+        <w:t>0] из l</w:t>
+      </w:r>
+    </w:p>
+    <w:p>
+      <w:pPr>
+        <w:spacing w:line="360" w:lineRule="auto"/>
+        <w:rPr>
+          <w:bCs/>
+          <w:sz w:val="28"/>
+          <w:szCs w:val="28"/>
+        </w:rPr>
+      </w:pPr>
+      <w:r>
+        <w:rPr>
+          <w:bCs/>
+          <w:sz w:val="28"/>
+          <w:szCs w:val="28"/>
+        </w:rPr>
+        <w:t xml:space="preserve">        иначе</w:t>
+      </w:r>
+    </w:p>
+    <w:p>
+      <w:pPr>
+        <w:spacing w:line="360" w:lineRule="auto"/>
+        <w:rPr>
+          <w:bCs/>
+          <w:sz w:val="28"/>
+          <w:szCs w:val="28"/>
+        </w:rPr>
+      </w:pPr>
+      <w:r>
+        <w:rPr>
+          <w:bCs/>
+          <w:sz w:val="28"/>
+          <w:szCs w:val="28"/>
+        </w:rPr>
+        <w:t xml:space="preserve">            добавить </w:t>
+      </w:r>
+      <w:proofErr w:type="gramStart"/>
+      <w:r>
+        <w:rPr>
+          <w:bCs/>
+          <w:sz w:val="28"/>
+          <w:szCs w:val="28"/>
+        </w:rPr>
+        <w:t>r[</w:t>
+      </w:r>
+      <w:proofErr w:type="gramEnd"/>
+      <w:r>
+        <w:rPr>
+          <w:bCs/>
+          <w:sz w:val="28"/>
+          <w:szCs w:val="28"/>
+        </w:rPr>
+        <w:t>0] в результат</w:t>
+      </w:r>
+    </w:p>
+    <w:p>
+      <w:pPr>
+        <w:spacing w:line="360" w:lineRule="auto"/>
+        <w:rPr>
+          <w:bCs/>
+          <w:sz w:val="28"/>
+          <w:szCs w:val="28"/>
+        </w:rPr>
+      </w:pPr>
+      <w:r>
+        <w:rPr>
+          <w:bCs/>
+          <w:sz w:val="28"/>
+          <w:szCs w:val="28"/>
+        </w:rPr>
+        <w:t xml:space="preserve">            удалить </w:t>
+      </w:r>
+      <w:proofErr w:type="gramStart"/>
+      <w:r>
+        <w:rPr>
+          <w:bCs/>
+          <w:sz w:val="28"/>
+          <w:szCs w:val="28"/>
+        </w:rPr>
+        <w:t>r[</w:t>
+      </w:r>
+      <w:proofErr w:type="gramEnd"/>
+      <w:r>
+        <w:rPr>
+          <w:bCs/>
+          <w:sz w:val="28"/>
+          <w:szCs w:val="28"/>
+        </w:rPr>
+        <w:t>0] из r</w:t>
+      </w:r>
+    </w:p>
+    <w:p>
+      <w:pPr>
+        <w:spacing w:line="360" w:lineRule="auto"/>
+        <w:rPr>
+          <w:bCs/>
+          <w:sz w:val="28"/>
+          <w:szCs w:val="28"/>
+        </w:rPr>
+      </w:pPr>
+      <w:r>
+        <w:rPr>
+          <w:bCs/>
+          <w:sz w:val="28"/>
+          <w:szCs w:val="28"/>
+        </w:rPr>
+        <w:t xml:space="preserve">        конец если</w:t>
+      </w:r>
+    </w:p>
+    <w:p>
+      <w:pPr>
+        <w:spacing w:line="360" w:lineRule="auto"/>
+        <w:rPr>
+          <w:bCs/>
+          <w:sz w:val="28"/>
+          <w:szCs w:val="28"/>
+        </w:rPr>
+      </w:pPr>
+      <w:r>
+        <w:rPr>
+          <w:bCs/>
+          <w:sz w:val="28"/>
+          <w:szCs w:val="28"/>
+        </w:rPr>
+        <w:t xml:space="preserve">    конец пока</w:t>
+      </w:r>
+    </w:p>
+    <w:p>
+      <w:pPr>
+        <w:spacing w:line="360" w:lineRule="auto"/>
+        <w:rPr>
+          <w:bCs/>
+          <w:sz w:val="28"/>
+          <w:szCs w:val="28"/>
+        </w:rPr>
+      </w:pPr>
+      <w:r>
+        <w:rPr>
+          <w:bCs/>
+          <w:sz w:val="28"/>
+          <w:szCs w:val="28"/>
+        </w:rPr>
+        <w:t xml:space="preserve">    добавить оставшиеся элементы l и r в результат</w:t>
+      </w:r>
+    </w:p>
+    <w:p>
+      <w:pPr>
+        <w:spacing w:line="360" w:lineRule="auto"/>
+        <w:rPr>
+          <w:bCs/>
+          <w:sz w:val="28"/>
+          <w:szCs w:val="28"/>
+        </w:rPr>
+      </w:pPr>
+      <w:r>
+        <w:rPr>
+          <w:bCs/>
+          <w:sz w:val="28"/>
+          <w:szCs w:val="28"/>
+        </w:rPr>
+        <w:t xml:space="preserve">    вернуть результат</w:t>
+      </w:r>
+    </w:p>
+    <w:p>
+      <w:pPr>
+        <w:spacing w:line="360" w:lineRule="auto"/>
+        <w:rPr>
+          <w:bCs/>
+          <w:sz w:val="28"/>
+          <w:szCs w:val="28"/>
+        </w:rPr>
+      </w:pPr>
+      <w:r>
+        <w:rPr>
+          <w:bCs/>
+          <w:sz w:val="28"/>
+          <w:szCs w:val="28"/>
+        </w:rPr>
+        <w:t>конец функции</w:t>
+      </w:r>
+      <w:r>
+        <w:rPr>
+          <w:bCs/>
+          <w:sz w:val="28"/>
+          <w:szCs w:val="28"/>
+        </w:rPr>
+        <w:t xml:space="preserve"> </w:t>
+      </w:r>
+      <w:r>
+        <w:rPr>
+          <w:bCs/>
+          <w:sz w:val="28"/>
+          <w:szCs w:val="28"/>
+        </w:rPr>
+        <w:br w:type="page"/>
+      </w:r>
+    </w:p>
+    <w:p>
+      <w:pPr>
+        <w:spacing w:line="360" w:lineRule="auto"/>
         <w:jc w:val="both"/>
         <w:rPr>
           <w:sz w:val="28"/>
@@ -6404,6 +8292,7 @@
         <w:rPr>
           <w:sz w:val="28"/>
           <w:szCs w:val="28"/>
+          <w:lang w:val="en-US"/>
         </w:rPr>
       </w:pPr>
       <w:r>
@@ -6864,30 +8753,16 @@
         <w:rPr>
           <w:sz w:val="28"/>
           <w:szCs w:val="28"/>
-        </w:rPr>
-        <w:t xml:space="preserve">0 ? </w:t>
-      </w:r>
-      <w:proofErr w:type="spellStart"/>
-      <w:r>
-        <w:rPr>
-          <w:sz w:val="28"/>
-          <w:szCs w:val="28"/>
-        </w:rPr>
-        <w:t>compare</w:t>
-      </w:r>
-      <w:proofErr w:type="spellEnd"/>
-      <w:r>
-        <w:rPr>
-          <w:sz w:val="28"/>
-          <w:szCs w:val="28"/>
-        </w:rPr>
-        <w:t xml:space="preserve"> : </w:t>
-      </w:r>
-      <w:proofErr w:type="spellStart"/>
-      <w:r>
-        <w:rPr>
-          <w:sz w:val="28"/>
-          <w:szCs w:val="28"/>
+          <w:lang w:val="en-US"/>
+        </w:rPr>
+        <w:t xml:space="preserve">0 ? compare : </w:t>
+      </w:r>
+      <w:proofErr w:type="spellStart"/>
+      <w:r>
+        <w:rPr>
+          <w:sz w:val="28"/>
+          <w:szCs w:val="28"/>
+          <w:lang w:val="en-US"/>
         </w:rPr>
         <w:t>other.FullName.CompareTo</w:t>
       </w:r>
@@ -6896,6 +8771,7 @@
         <w:rPr>
           <w:sz w:val="28"/>
           <w:szCs w:val="28"/>
+          <w:lang w:val="en-US"/>
         </w:rPr>
         <w:t>(</w:t>
       </w:r>
@@ -6904,6 +8780,7 @@
         <w:rPr>
           <w:sz w:val="28"/>
           <w:szCs w:val="28"/>
+          <w:lang w:val="en-US"/>
         </w:rPr>
         <w:t>FullName</w:t>
       </w:r>
@@ -6912,6 +8789,7 @@
         <w:rPr>
           <w:sz w:val="28"/>
           <w:szCs w:val="28"/>
+          <w:lang w:val="en-US"/>
         </w:rPr>
         <w:t>);</w:t>
       </w:r>
@@ -6919,6 +8797,7 @@
         <w:rPr>
           <w:sz w:val="28"/>
           <w:szCs w:val="28"/>
+          <w:lang w:val="en-US"/>
         </w:rPr>
         <w:br/>
         <w:t xml:space="preserve">    }</w:t>
@@ -6927,6 +8806,7 @@
         <w:rPr>
           <w:sz w:val="28"/>
           <w:szCs w:val="28"/>
+          <w:lang w:val="en-US"/>
         </w:rPr>
         <w:br/>
         <w:t>}</w:t>
@@ -9709,16 +11589,16 @@
         <w:rPr>
           <w:b/>
           <w:bCs/>
-          <w:sz w:val="28"/>
-          <w:szCs w:val="28"/>
+          <w:sz w:val="32"/>
+          <w:szCs w:val="32"/>
         </w:rPr>
       </w:pPr>
       <w:r>
         <w:rPr>
           <w:b/>
           <w:bCs/>
-          <w:sz w:val="28"/>
-          <w:szCs w:val="28"/>
+          <w:sz w:val="32"/>
+          <w:szCs w:val="32"/>
         </w:rPr>
         <w:t>Сравнение двух алгоритмов по времени их работы</w:t>
       </w:r>
@@ -9748,7 +11628,21 @@
           <w:sz w:val="28"/>
           <w:szCs w:val="28"/>
         </w:rPr>
-        <w:t xml:space="preserve">Для проведения тестов решено было провести 16 </w:t>
+        <w:t xml:space="preserve">Для проведения тестов решено было </w:t>
+      </w:r>
+      <w:r>
+        <w:rPr>
+          <w:sz w:val="28"/>
+          <w:szCs w:val="28"/>
+        </w:rPr>
+        <w:t>выбрать</w:t>
+      </w:r>
+      <w:r>
+        <w:rPr>
+          <w:sz w:val="28"/>
+          <w:szCs w:val="28"/>
+        </w:rPr>
+        <w:t xml:space="preserve"> 16 </w:t>
       </w:r>
       <w:r>
         <w:rPr>
@@ -9790,7 +11684,15 @@
           <w:sz w:val="28"/>
           <w:szCs w:val="28"/>
         </w:rPr>
-        <w:t>: 2</w:t>
+        <w:t xml:space="preserve">: </w:t>
+      </w:r>
+      <w:proofErr w:type="gramStart"/>
+      <w:r>
+        <w:rPr>
+          <w:sz w:val="28"/>
+          <w:szCs w:val="28"/>
+        </w:rPr>
+        <w:t>2</w:t>
       </w:r>
       <w:proofErr w:type="spellStart"/>
       <w:r>
@@ -9803,6 +11705,7 @@
         <w:t>i</w:t>
       </w:r>
       <w:proofErr w:type="spellEnd"/>
+      <w:proofErr w:type="gramEnd"/>
       <w:r>
         <w:rPr>
           <w:sz w:val="28"/>
@@ -11450,10 +13353,66 @@
         </w:rPr>
         <w:lastRenderedPageBreak/>
         <w:drawing>
-          <wp:inline distT="0" distB="0" distL="0" distR="0" wp14:anchorId="23F21E85" wp14:editId="0C94DD19">
-            <wp:extent cx="5716988" cy="2391410"/>
-            <wp:effectExtent l="0" t="0" r="17145" b="8890"/>
-            <wp:docPr id="741838523" name="Диаграмма 1">
+          <wp:anchor distT="0" distB="0" distL="114300" distR="114300" simplePos="0" relativeHeight="251659264" behindDoc="1" locked="0" layoutInCell="1" allowOverlap="1" wp14:anchorId="1BF0F6D7" wp14:editId="2774A042">
+            <wp:simplePos x="0" y="0"/>
+            <wp:positionH relativeFrom="column">
+              <wp:posOffset>100965</wp:posOffset>
+            </wp:positionH>
+            <wp:positionV relativeFrom="paragraph">
+              <wp:posOffset>2756535</wp:posOffset>
+            </wp:positionV>
+            <wp:extent cx="5940425" cy="2581910"/>
+            <wp:effectExtent l="0" t="0" r="3175" b="8890"/>
+            <wp:wrapTight wrapText="bothSides">
+              <wp:wrapPolygon edited="0">
+                <wp:start x="0" y="0"/>
+                <wp:lineTo x="0" y="21515"/>
+                <wp:lineTo x="21542" y="21515"/>
+                <wp:lineTo x="21542" y="0"/>
+                <wp:lineTo x="0" y="0"/>
+              </wp:wrapPolygon>
+            </wp:wrapTight>
+            <wp:docPr id="684952627" name="Диаграмма 1">
+              <a:extLst xmlns:a="http://schemas.openxmlformats.org/drawingml/2006/main">
+                <a:ext uri="{FF2B5EF4-FFF2-40B4-BE49-F238E27FC236}">
+                  <a16:creationId xmlns:a16="http://schemas.microsoft.com/office/drawing/2014/main" id="{B15696A5-1B19-DB86-B083-3EF6C9CB8CAB}"/>
+                </a:ext>
+              </a:extLst>
+            </wp:docPr>
+            <wp:cNvGraphicFramePr/>
+            <a:graphic xmlns:a="http://schemas.openxmlformats.org/drawingml/2006/main">
+              <a:graphicData uri="http://schemas.openxmlformats.org/drawingml/2006/chart">
+                <c:chart xmlns:c="http://schemas.openxmlformats.org/drawingml/2006/chart" xmlns:r="http://schemas.openxmlformats.org/officeDocument/2006/relationships" r:id="rId6"/>
+              </a:graphicData>
+            </a:graphic>
+          </wp:anchor>
+        </w:drawing>
+      </w:r>
+      <w:r>
+        <w:rPr>
+          <w:noProof/>
+        </w:rPr>
+        <w:drawing>
+          <wp:anchor distT="0" distB="0" distL="114300" distR="114300" simplePos="0" relativeHeight="251658240" behindDoc="1" locked="0" layoutInCell="1" allowOverlap="1" wp14:anchorId="00070269" wp14:editId="63AA3CB4">
+            <wp:simplePos x="0" y="0"/>
+            <wp:positionH relativeFrom="column">
+              <wp:posOffset>81915</wp:posOffset>
+            </wp:positionH>
+            <wp:positionV relativeFrom="paragraph">
+              <wp:posOffset>0</wp:posOffset>
+            </wp:positionV>
+            <wp:extent cx="5940425" cy="2391410"/>
+            <wp:effectExtent l="0" t="0" r="3175" b="8890"/>
+            <wp:wrapTight wrapText="bothSides">
+              <wp:wrapPolygon edited="0">
+                <wp:start x="0" y="0"/>
+                <wp:lineTo x="0" y="21508"/>
+                <wp:lineTo x="21542" y="21508"/>
+                <wp:lineTo x="21542" y="0"/>
+                <wp:lineTo x="0" y="0"/>
+              </wp:wrapPolygon>
+            </wp:wrapTight>
+            <wp:docPr id="1514980931" name="Диаграмма 1">
               <a:extLst xmlns:a="http://schemas.openxmlformats.org/drawingml/2006/main">
                 <a:ext uri="{FF2B5EF4-FFF2-40B4-BE49-F238E27FC236}">
                   <a16:creationId xmlns:a16="http://schemas.microsoft.com/office/drawing/2014/main" id="{D5951ECB-88F3-51F3-75B3-9C930422447D}"/>
@@ -11463,51 +13422,16 @@
             <wp:cNvGraphicFramePr/>
             <a:graphic xmlns:a="http://schemas.openxmlformats.org/drawingml/2006/main">
               <a:graphicData uri="http://schemas.openxmlformats.org/drawingml/2006/chart">
-                <c:chart xmlns:c="http://schemas.openxmlformats.org/drawingml/2006/chart" xmlns:r="http://schemas.openxmlformats.org/officeDocument/2006/relationships" r:id="rId6"/>
-              </a:graphicData>
-            </a:graphic>
-          </wp:inline>
-        </w:drawing>
-      </w:r>
-    </w:p>
-    <w:p>
-      <w:pPr>
-        <w:spacing w:line="360" w:lineRule="auto"/>
-        <w:ind w:left="360"/>
-        <w:rPr>
-          <w:sz w:val="28"/>
-          <w:szCs w:val="28"/>
-        </w:rPr>
-      </w:pPr>
-      <w:r>
-        <w:rPr>
-          <w:noProof/>
-        </w:rPr>
-        <w:drawing>
-          <wp:inline distT="0" distB="0" distL="0" distR="0" wp14:anchorId="785B755E" wp14:editId="38AECD99">
-            <wp:extent cx="5693134" cy="2581910"/>
-            <wp:effectExtent l="0" t="0" r="3175" b="8890"/>
-            <wp:docPr id="2072059861" name="Диаграмма 1">
-              <a:extLst xmlns:a="http://schemas.openxmlformats.org/drawingml/2006/main">
-                <a:ext uri="{FF2B5EF4-FFF2-40B4-BE49-F238E27FC236}">
-                  <a16:creationId xmlns:a16="http://schemas.microsoft.com/office/drawing/2014/main" id="{B15696A5-1B19-DB86-B083-3EF6C9CB8CAB}"/>
-                </a:ext>
-              </a:extLst>
-            </wp:docPr>
-            <wp:cNvGraphicFramePr/>
-            <a:graphic xmlns:a="http://schemas.openxmlformats.org/drawingml/2006/main">
-              <a:graphicData uri="http://schemas.openxmlformats.org/drawingml/2006/chart">
                 <c:chart xmlns:c="http://schemas.openxmlformats.org/drawingml/2006/chart" xmlns:r="http://schemas.openxmlformats.org/officeDocument/2006/relationships" r:id="rId7"/>
               </a:graphicData>
             </a:graphic>
-          </wp:inline>
+          </wp:anchor>
         </w:drawing>
       </w:r>
     </w:p>
     <w:p>
       <w:pPr>
         <w:spacing w:line="360" w:lineRule="auto"/>
-        <w:ind w:left="360"/>
         <w:rPr>
           <w:sz w:val="28"/>
           <w:szCs w:val="28"/>
@@ -11522,36 +13446,18 @@
         <w:rPr>
           <w:b/>
           <w:bCs/>
-          <w:sz w:val="28"/>
-          <w:szCs w:val="28"/>
+          <w:sz w:val="32"/>
+          <w:szCs w:val="32"/>
         </w:rPr>
       </w:pPr>
       <w:r>
         <w:rPr>
           <w:b/>
           <w:bCs/>
-          <w:sz w:val="28"/>
-          <w:szCs w:val="28"/>
-        </w:rPr>
-        <w:t>Н</w:t>
-      </w:r>
-      <w:r>
-        <w:rPr>
-          <w:b/>
-          <w:bCs/>
-          <w:sz w:val="28"/>
-          <w:szCs w:val="28"/>
-        </w:rPr>
-        <w:t>аихудшее и наилучшее значение времени сортиров</w:t>
-      </w:r>
-      <w:r>
-        <w:rPr>
-          <w:b/>
-          <w:bCs/>
-          <w:sz w:val="28"/>
-          <w:szCs w:val="28"/>
-        </w:rPr>
-        <w:t>ок</w:t>
+          <w:sz w:val="32"/>
+          <w:szCs w:val="32"/>
+        </w:rPr>
+        <w:t>Наихудшее и наилучшее значение времени сортировок</w:t>
       </w:r>
     </w:p>
     <w:p>
@@ -11559,17 +13465,16 @@
         <w:spacing w:line="360" w:lineRule="auto"/>
         <w:ind w:left="360"/>
         <w:rPr>
-          <w:lang w:val="en-US"/>
-        </w:rPr>
-      </w:pPr>
-      <w:r>
-        <w:t>Условия</w:t>
-      </w:r>
-      <w:r>
-        <w:rPr>
-          <w:lang w:val="en-US"/>
-        </w:rPr>
-        <w:t>:</w:t>
+          <w:sz w:val="28"/>
+          <w:szCs w:val="28"/>
+        </w:rPr>
+      </w:pPr>
+      <w:r>
+        <w:rPr>
+          <w:sz w:val="28"/>
+          <w:szCs w:val="28"/>
+        </w:rPr>
+        <w:t>Условия:</w:t>
       </w:r>
     </w:p>
     <w:p>
@@ -11577,18 +13482,29 @@
         <w:spacing w:line="360" w:lineRule="auto"/>
         <w:ind w:left="360"/>
         <w:rPr>
-          <w:lang w:val="en-US"/>
-        </w:rPr>
-      </w:pPr>
-      <w:r>
-        <w:rPr>
-          <w:lang w:val="en-US"/>
-        </w:rPr>
-        <w:t xml:space="preserve">N = </w:t>
-      </w:r>
-      <w:r>
-        <w:rPr>
-          <w:lang w:val="en-US"/>
+          <w:sz w:val="28"/>
+          <w:szCs w:val="28"/>
+        </w:rPr>
+      </w:pPr>
+      <w:r>
+        <w:rPr>
+          <w:sz w:val="28"/>
+          <w:szCs w:val="28"/>
+          <w:lang w:val="en-US"/>
+        </w:rPr>
+        <w:t>N</w:t>
+      </w:r>
+      <w:r>
+        <w:rPr>
+          <w:sz w:val="28"/>
+          <w:szCs w:val="28"/>
+        </w:rPr>
+        <w:t xml:space="preserve"> = </w:t>
+      </w:r>
+      <w:r>
+        <w:rPr>
+          <w:sz w:val="28"/>
+          <w:szCs w:val="28"/>
         </w:rPr>
         <w:t>50000</w:t>
       </w:r>
@@ -11597,8 +13513,17 @@
       <w:pPr>
         <w:spacing w:line="360" w:lineRule="auto"/>
         <w:ind w:left="360"/>
-      </w:pPr>
-      <w:r>
+        <w:rPr>
+          <w:sz w:val="28"/>
+          <w:szCs w:val="28"/>
+          <w:lang w:val="en-US"/>
+        </w:rPr>
+      </w:pPr>
+      <w:r>
+        <w:rPr>
+          <w:sz w:val="28"/>
+          <w:szCs w:val="28"/>
+        </w:rPr>
         <w:t>Для наилучшего случая массив будет уже отсортирован</w:t>
       </w:r>
     </w:p>
@@ -11606,8 +13531,33 @@
       <w:pPr>
         <w:spacing w:line="360" w:lineRule="auto"/>
         <w:ind w:left="360"/>
-      </w:pPr>
-      <w:r>
+        <w:rPr>
+          <w:sz w:val="28"/>
+          <w:szCs w:val="28"/>
+        </w:rPr>
+      </w:pPr>
+      <w:r>
+        <w:rPr>
+          <w:sz w:val="28"/>
+          <w:szCs w:val="28"/>
+        </w:rPr>
+        <w:t>Для обычного случая элементы будут расположены в случайном порядке</w:t>
+      </w:r>
+    </w:p>
+    <w:p>
+      <w:pPr>
+        <w:spacing w:line="360" w:lineRule="auto"/>
+        <w:ind w:left="360"/>
+        <w:rPr>
+          <w:sz w:val="28"/>
+          <w:szCs w:val="28"/>
+        </w:rPr>
+      </w:pPr>
+      <w:r>
+        <w:rPr>
+          <w:sz w:val="28"/>
+          <w:szCs w:val="28"/>
+        </w:rPr>
         <w:t>Для наихудшего случая массив будет отсортирован в обратном порядке</w:t>
       </w:r>
     </w:p>
@@ -11710,6 +13660,21 @@
             <w:r>
               <w:t>8002</w:t>
             </w:r>
+            <w:r>
+              <w:rPr>
+                <w:lang w:val="en-US"/>
+              </w:rPr>
+              <w:t xml:space="preserve"> </w:t>
+            </w:r>
+            <w:r>
+              <w:rPr>
+                <w:rFonts w:ascii="Calibri" w:hAnsi="Calibri" w:cs="Calibri"/>
+                <w:color w:val="000000"/>
+                <w:sz w:val="22"/>
+                <w:szCs w:val="22"/>
+              </w:rPr>
+              <w:t>µs</w:t>
+            </w:r>
           </w:p>
         </w:tc>
         <w:tc>
@@ -11725,6 +13690,77 @@
             </w:pPr>
             <w:r>
               <w:t>7339</w:t>
+            </w:r>
+            <w:r>
+              <w:rPr>
+                <w:lang w:val="en-US"/>
+              </w:rPr>
+              <w:t xml:space="preserve"> </w:t>
+            </w:r>
+            <w:r>
+              <w:rPr>
+                <w:rFonts w:ascii="Calibri" w:hAnsi="Calibri" w:cs="Calibri"/>
+                <w:color w:val="000000"/>
+                <w:sz w:val="22"/>
+                <w:szCs w:val="22"/>
+              </w:rPr>
+              <w:t>µs</w:t>
+            </w:r>
+          </w:p>
+        </w:tc>
+      </w:tr>
+      <w:tr>
+        <w:tc>
+          <w:tcPr>
+            <w:tcW w:w="2995" w:type="dxa"/>
+          </w:tcPr>
+          <w:p>
+            <w:pPr>
+              <w:spacing w:line="360" w:lineRule="auto"/>
+            </w:pPr>
+            <w:r>
+              <w:t>Обычный случай</w:t>
+            </w:r>
+          </w:p>
+        </w:tc>
+        <w:tc>
+          <w:tcPr>
+            <w:tcW w:w="2995" w:type="dxa"/>
+          </w:tcPr>
+          <w:p>
+            <w:pPr>
+              <w:spacing w:line="360" w:lineRule="auto"/>
+            </w:pPr>
+            <w:r>
+              <w:t>17027119</w:t>
+            </w:r>
+            <w:r>
+              <w:t xml:space="preserve"> µs</w:t>
+            </w:r>
+          </w:p>
+        </w:tc>
+        <w:tc>
+          <w:tcPr>
+            <w:tcW w:w="2995" w:type="dxa"/>
+          </w:tcPr>
+          <w:p>
+            <w:pPr>
+              <w:spacing w:line="360" w:lineRule="auto"/>
+            </w:pPr>
+            <w:r>
+              <w:t>74362</w:t>
+            </w:r>
+            <w:r>
+              <w:t xml:space="preserve"> </w:t>
+            </w:r>
+            <w:r>
+              <w:rPr>
+                <w:rFonts w:ascii="Calibri" w:hAnsi="Calibri" w:cs="Calibri"/>
+                <w:color w:val="000000"/>
+                <w:sz w:val="22"/>
+                <w:szCs w:val="22"/>
+              </w:rPr>
+              <w:t>µs</w:t>
             </w:r>
           </w:p>
         </w:tc>
@@ -11760,6 +13796,21 @@
             <w:r>
               <w:t>37427368</w:t>
             </w:r>
+            <w:r>
+              <w:rPr>
+                <w:lang w:val="en-US"/>
+              </w:rPr>
+              <w:t xml:space="preserve"> </w:t>
+            </w:r>
+            <w:r>
+              <w:rPr>
+                <w:rFonts w:ascii="Calibri" w:hAnsi="Calibri" w:cs="Calibri"/>
+                <w:color w:val="000000"/>
+                <w:sz w:val="22"/>
+                <w:szCs w:val="22"/>
+              </w:rPr>
+              <w:t>µs</w:t>
+            </w:r>
           </w:p>
         </w:tc>
         <w:tc>
@@ -11776,6 +13827,21 @@
             <w:r>
               <w:t>151686</w:t>
             </w:r>
+            <w:r>
+              <w:rPr>
+                <w:lang w:val="en-US"/>
+              </w:rPr>
+              <w:t xml:space="preserve"> </w:t>
+            </w:r>
+            <w:r>
+              <w:rPr>
+                <w:rFonts w:ascii="Calibri" w:hAnsi="Calibri" w:cs="Calibri"/>
+                <w:color w:val="000000"/>
+                <w:sz w:val="22"/>
+                <w:szCs w:val="22"/>
+              </w:rPr>
+              <w:t>µs</w:t>
+            </w:r>
           </w:p>
         </w:tc>
       </w:tr>
@@ -11789,99 +13855,86 @@
     <w:p>
       <w:pPr>
         <w:spacing w:line="360" w:lineRule="auto"/>
-      </w:pPr>
-      <w:r>
-        <w:t>Из таблицы видно что алгоритмы показывают себя практически одинаково по времени при сортировки отсортированного массива</w:t>
-      </w:r>
-      <w:r>
-        <w:t>,</w:t>
-      </w:r>
-      <w:r>
-        <w:t xml:space="preserve"> что соответствует асимптотической сложности </w:t>
-      </w:r>
-      <w:r>
-        <w:t>O(n)</w:t>
-      </w:r>
-      <w:r>
-        <w:t>. В обратном случае</w:t>
-      </w:r>
-      <w:r>
-        <w:t xml:space="preserve">, </w:t>
-      </w:r>
-      <w:r>
-        <w:t xml:space="preserve">когда массив отсортирован в обратном порядке, </w:t>
-      </w:r>
-      <w:r>
+        <w:rPr>
+          <w:sz w:val="28"/>
+          <w:szCs w:val="28"/>
+        </w:rPr>
+      </w:pPr>
+      <w:r>
+        <w:rPr>
+          <w:sz w:val="28"/>
+          <w:szCs w:val="28"/>
+        </w:rPr>
         <w:lastRenderedPageBreak/>
-        <w:t>алгоритмы показывают совершенно разные результаты</w:t>
-      </w:r>
-      <w:r>
-        <w:t xml:space="preserve">, </w:t>
-      </w:r>
-      <w:r>
-        <w:t xml:space="preserve">что соответствует асимптотам </w:t>
-      </w:r>
-      <w:r>
-        <w:t>O(n²)</w:t>
-      </w:r>
-      <w:r>
-        <w:t xml:space="preserve"> </w:t>
-      </w:r>
-      <w:r>
-        <w:t xml:space="preserve">для </w:t>
-      </w:r>
-      <w:proofErr w:type="spellStart"/>
-      <w:r>
-        <w:t>п</w:t>
-      </w:r>
-      <w:r>
-        <w:t>рям</w:t>
-      </w:r>
-      <w:r>
-        <w:t>х</w:t>
-      </w:r>
-      <w:r>
-        <w:t>е</w:t>
-      </w:r>
-      <w:proofErr w:type="spellEnd"/>
-      <w:r>
-        <w:t xml:space="preserve"> встав</w:t>
-      </w:r>
-      <w:r>
-        <w:t xml:space="preserve">ок и </w:t>
-      </w:r>
-      <w:r>
-        <w:t xml:space="preserve">O(n </w:t>
-      </w:r>
-      <w:proofErr w:type="spellStart"/>
-      <w:r>
+        <w:t xml:space="preserve">Из таблицы </w:t>
+      </w:r>
+      <w:r>
+        <w:rPr>
+          <w:sz w:val="28"/>
+          <w:szCs w:val="28"/>
+        </w:rPr>
+        <w:t>видно,</w:t>
+      </w:r>
+      <w:r>
+        <w:rPr>
+          <w:sz w:val="28"/>
+          <w:szCs w:val="28"/>
+        </w:rPr>
+        <w:t xml:space="preserve"> что алгоритмы показывают себя практически одинаково по времени при сортировки отсортированного массива, что соответствует асимптотической сложности O(n). В обратном случае, когда массив отсортирован в обратном порядке, алгоритмы показывают совершенно разные результаты, что соответствует асимптотам O(n²) для </w:t>
+      </w:r>
+      <w:r>
+        <w:rPr>
+          <w:sz w:val="28"/>
+          <w:szCs w:val="28"/>
+        </w:rPr>
+        <w:t>прямых</w:t>
+      </w:r>
+      <w:r>
+        <w:rPr>
+          <w:sz w:val="28"/>
+          <w:szCs w:val="28"/>
+        </w:rPr>
+        <w:t xml:space="preserve"> вставок и </w:t>
+      </w:r>
+      <w:proofErr w:type="gramStart"/>
+      <w:r>
+        <w:rPr>
+          <w:sz w:val="28"/>
+          <w:szCs w:val="28"/>
+        </w:rPr>
+        <w:t>O(</w:t>
+      </w:r>
+      <w:proofErr w:type="gramEnd"/>
+      <w:r>
+        <w:rPr>
+          <w:sz w:val="28"/>
+          <w:szCs w:val="28"/>
+        </w:rPr>
+        <w:t xml:space="preserve">n </w:t>
+      </w:r>
+      <w:proofErr w:type="spellStart"/>
+      <w:r>
+        <w:rPr>
+          <w:sz w:val="28"/>
+          <w:szCs w:val="28"/>
+        </w:rPr>
         <w:t>log</w:t>
       </w:r>
       <w:proofErr w:type="spellEnd"/>
       <w:r>
-        <w:t xml:space="preserve"> n)</w:t>
-      </w:r>
-      <w:r>
-        <w:t xml:space="preserve"> для е</w:t>
-      </w:r>
-      <w:r>
-        <w:t>стественно</w:t>
-      </w:r>
-      <w:r>
-        <w:t xml:space="preserve">го </w:t>
-      </w:r>
-      <w:r>
-        <w:t>слияни</w:t>
-      </w:r>
-      <w:r>
-        <w:t>я.</w:t>
+        <w:rPr>
+          <w:sz w:val="28"/>
+          <w:szCs w:val="28"/>
+        </w:rPr>
+        <w:t xml:space="preserve"> n) для естественного слияния.</w:t>
       </w:r>
     </w:p>
     <w:p>
       <w:pPr>
         <w:spacing w:line="360" w:lineRule="auto"/>
         <w:rPr>
-          <w:lang w:val="en-US"/>
+          <w:sz w:val="28"/>
+          <w:szCs w:val="28"/>
         </w:rPr>
       </w:pPr>
     </w:p>
@@ -11892,16 +13945,16 @@
         <w:rPr>
           <w:b/>
           <w:bCs/>
-          <w:sz w:val="28"/>
-          <w:szCs w:val="28"/>
+          <w:sz w:val="32"/>
+          <w:szCs w:val="32"/>
         </w:rPr>
       </w:pPr>
       <w:r>
         <w:rPr>
           <w:b/>
           <w:bCs/>
-          <w:sz w:val="28"/>
-          <w:szCs w:val="28"/>
+          <w:sz w:val="32"/>
+          <w:szCs w:val="32"/>
         </w:rPr>
         <w:t>Стабильность сортировок</w:t>
       </w:r>
@@ -11909,15 +13962,18 @@
     <w:p>
       <w:pPr>
         <w:spacing w:line="360" w:lineRule="auto"/>
-      </w:pPr>
-      <w:r>
+        <w:rPr>
+          <w:sz w:val="28"/>
+          <w:szCs w:val="28"/>
+        </w:rPr>
+      </w:pPr>
+      <w:r>
+        <w:rPr>
+          <w:sz w:val="28"/>
+          <w:szCs w:val="28"/>
+        </w:rPr>
         <w:t>Для теста было взято 10 элементов с одинаковыми ключами и значения</w:t>
       </w:r>
-    </w:p>
-    <w:p>
-      <w:pPr>
-        <w:spacing w:line="360" w:lineRule="auto"/>
-      </w:pPr>
     </w:p>
     <w:tbl>
       <w:tblPr>
@@ -11928,11 +13984,13 @@
       <w:tblGrid>
         <w:gridCol w:w="1413"/>
         <w:gridCol w:w="3544"/>
+        <w:gridCol w:w="708"/>
       </w:tblGrid>
       <w:tr>
         <w:tc>
           <w:tcPr>
             <w:tcW w:w="1413" w:type="dxa"/>
+            <w:shd w:val="clear" w:color="auto" w:fill="F79646" w:themeFill="accent6"/>
           </w:tcPr>
           <w:p>
             <w:pPr>
@@ -11946,6 +14004,7 @@
         <w:tc>
           <w:tcPr>
             <w:tcW w:w="3544" w:type="dxa"/>
+            <w:shd w:val="clear" w:color="auto" w:fill="F79646" w:themeFill="accent6"/>
           </w:tcPr>
           <w:p>
             <w:pPr>
@@ -11956,11 +14015,26 @@
             </w:r>
           </w:p>
         </w:tc>
+        <w:tc>
+          <w:tcPr>
+            <w:tcW w:w="708" w:type="dxa"/>
+            <w:shd w:val="clear" w:color="auto" w:fill="F79646" w:themeFill="accent6"/>
+          </w:tcPr>
+          <w:p>
+            <w:pPr>
+              <w:spacing w:line="360" w:lineRule="auto"/>
+            </w:pPr>
+            <w:r>
+              <w:t>1</w:t>
+            </w:r>
+          </w:p>
+        </w:tc>
       </w:tr>
       <w:tr>
         <w:tc>
           <w:tcPr>
             <w:tcW w:w="1413" w:type="dxa"/>
+            <w:shd w:val="clear" w:color="auto" w:fill="00B050"/>
           </w:tcPr>
           <w:p>
             <w:pPr>
@@ -11974,6 +14048,7 @@
         <w:tc>
           <w:tcPr>
             <w:tcW w:w="3544" w:type="dxa"/>
+            <w:shd w:val="clear" w:color="auto" w:fill="00B050"/>
           </w:tcPr>
           <w:p>
             <w:pPr>
@@ -11984,11 +14059,26 @@
             </w:r>
           </w:p>
         </w:tc>
+        <w:tc>
+          <w:tcPr>
+            <w:tcW w:w="708" w:type="dxa"/>
+            <w:shd w:val="clear" w:color="auto" w:fill="00B050"/>
+          </w:tcPr>
+          <w:p>
+            <w:pPr>
+              <w:spacing w:line="360" w:lineRule="auto"/>
+            </w:pPr>
+            <w:r>
+              <w:t>2</w:t>
+            </w:r>
+          </w:p>
+        </w:tc>
       </w:tr>
       <w:tr>
         <w:tc>
           <w:tcPr>
             <w:tcW w:w="1413" w:type="dxa"/>
+            <w:shd w:val="clear" w:color="auto" w:fill="F79646" w:themeFill="accent6"/>
           </w:tcPr>
           <w:p>
             <w:pPr>
@@ -12002,6 +14092,7 @@
         <w:tc>
           <w:tcPr>
             <w:tcW w:w="3544" w:type="dxa"/>
+            <w:shd w:val="clear" w:color="auto" w:fill="F79646" w:themeFill="accent6"/>
           </w:tcPr>
           <w:p>
             <w:pPr>
@@ -12012,11 +14103,26 @@
             </w:r>
           </w:p>
         </w:tc>
+        <w:tc>
+          <w:tcPr>
+            <w:tcW w:w="708" w:type="dxa"/>
+            <w:shd w:val="clear" w:color="auto" w:fill="F79646" w:themeFill="accent6"/>
+          </w:tcPr>
+          <w:p>
+            <w:pPr>
+              <w:spacing w:line="360" w:lineRule="auto"/>
+            </w:pPr>
+            <w:r>
+              <w:t>3</w:t>
+            </w:r>
+          </w:p>
+        </w:tc>
       </w:tr>
       <w:tr>
         <w:tc>
           <w:tcPr>
             <w:tcW w:w="1413" w:type="dxa"/>
+            <w:shd w:val="clear" w:color="auto" w:fill="00B050"/>
           </w:tcPr>
           <w:p>
             <w:pPr>
@@ -12030,6 +14136,7 @@
         <w:tc>
           <w:tcPr>
             <w:tcW w:w="3544" w:type="dxa"/>
+            <w:shd w:val="clear" w:color="auto" w:fill="00B050"/>
           </w:tcPr>
           <w:p>
             <w:pPr>
@@ -12040,11 +14147,26 @@
             </w:r>
           </w:p>
         </w:tc>
+        <w:tc>
+          <w:tcPr>
+            <w:tcW w:w="708" w:type="dxa"/>
+            <w:shd w:val="clear" w:color="auto" w:fill="00B050"/>
+          </w:tcPr>
+          <w:p>
+            <w:pPr>
+              <w:spacing w:line="360" w:lineRule="auto"/>
+            </w:pPr>
+            <w:r>
+              <w:t>4</w:t>
+            </w:r>
+          </w:p>
+        </w:tc>
       </w:tr>
       <w:tr>
         <w:tc>
           <w:tcPr>
             <w:tcW w:w="1413" w:type="dxa"/>
+            <w:shd w:val="clear" w:color="auto" w:fill="F79646" w:themeFill="accent6"/>
           </w:tcPr>
           <w:p>
             <w:pPr>
@@ -12058,6 +14180,7 @@
         <w:tc>
           <w:tcPr>
             <w:tcW w:w="3544" w:type="dxa"/>
+            <w:shd w:val="clear" w:color="auto" w:fill="F79646" w:themeFill="accent6"/>
           </w:tcPr>
           <w:p>
             <w:pPr>
@@ -12068,11 +14191,26 @@
             </w:r>
           </w:p>
         </w:tc>
+        <w:tc>
+          <w:tcPr>
+            <w:tcW w:w="708" w:type="dxa"/>
+            <w:shd w:val="clear" w:color="auto" w:fill="F79646" w:themeFill="accent6"/>
+          </w:tcPr>
+          <w:p>
+            <w:pPr>
+              <w:spacing w:line="360" w:lineRule="auto"/>
+            </w:pPr>
+            <w:r>
+              <w:t>5</w:t>
+            </w:r>
+          </w:p>
+        </w:tc>
       </w:tr>
       <w:tr>
         <w:tc>
           <w:tcPr>
             <w:tcW w:w="1413" w:type="dxa"/>
+            <w:shd w:val="clear" w:color="auto" w:fill="00B050"/>
           </w:tcPr>
           <w:p>
             <w:pPr>
@@ -12086,6 +14224,7 @@
         <w:tc>
           <w:tcPr>
             <w:tcW w:w="3544" w:type="dxa"/>
+            <w:shd w:val="clear" w:color="auto" w:fill="00B050"/>
           </w:tcPr>
           <w:p>
             <w:pPr>
@@ -12096,11 +14235,26 @@
             </w:r>
           </w:p>
         </w:tc>
+        <w:tc>
+          <w:tcPr>
+            <w:tcW w:w="708" w:type="dxa"/>
+            <w:shd w:val="clear" w:color="auto" w:fill="00B050"/>
+          </w:tcPr>
+          <w:p>
+            <w:pPr>
+              <w:spacing w:line="360" w:lineRule="auto"/>
+            </w:pPr>
+            <w:r>
+              <w:t>6</w:t>
+            </w:r>
+          </w:p>
+        </w:tc>
       </w:tr>
       <w:tr>
         <w:tc>
           <w:tcPr>
             <w:tcW w:w="1413" w:type="dxa"/>
+            <w:shd w:val="clear" w:color="auto" w:fill="F79646" w:themeFill="accent6"/>
           </w:tcPr>
           <w:p>
             <w:pPr>
@@ -12114,6 +14268,7 @@
         <w:tc>
           <w:tcPr>
             <w:tcW w:w="3544" w:type="dxa"/>
+            <w:shd w:val="clear" w:color="auto" w:fill="F79646" w:themeFill="accent6"/>
           </w:tcPr>
           <w:p>
             <w:pPr>
@@ -12124,11 +14279,26 @@
             </w:r>
           </w:p>
         </w:tc>
+        <w:tc>
+          <w:tcPr>
+            <w:tcW w:w="708" w:type="dxa"/>
+            <w:shd w:val="clear" w:color="auto" w:fill="F79646" w:themeFill="accent6"/>
+          </w:tcPr>
+          <w:p>
+            <w:pPr>
+              <w:spacing w:line="360" w:lineRule="auto"/>
+            </w:pPr>
+            <w:r>
+              <w:t>7</w:t>
+            </w:r>
+          </w:p>
+        </w:tc>
       </w:tr>
       <w:tr>
         <w:tc>
           <w:tcPr>
             <w:tcW w:w="1413" w:type="dxa"/>
+            <w:shd w:val="clear" w:color="auto" w:fill="00B050"/>
           </w:tcPr>
           <w:p>
             <w:pPr>
@@ -12142,6 +14312,7 @@
         <w:tc>
           <w:tcPr>
             <w:tcW w:w="3544" w:type="dxa"/>
+            <w:shd w:val="clear" w:color="auto" w:fill="00B050"/>
           </w:tcPr>
           <w:p>
             <w:pPr>
@@ -12152,11 +14323,26 @@
             </w:r>
           </w:p>
         </w:tc>
+        <w:tc>
+          <w:tcPr>
+            <w:tcW w:w="708" w:type="dxa"/>
+            <w:shd w:val="clear" w:color="auto" w:fill="00B050"/>
+          </w:tcPr>
+          <w:p>
+            <w:pPr>
+              <w:spacing w:line="360" w:lineRule="auto"/>
+            </w:pPr>
+            <w:r>
+              <w:t>8</w:t>
+            </w:r>
+          </w:p>
+        </w:tc>
       </w:tr>
       <w:tr>
         <w:tc>
           <w:tcPr>
             <w:tcW w:w="1413" w:type="dxa"/>
+            <w:shd w:val="clear" w:color="auto" w:fill="F79646" w:themeFill="accent6"/>
           </w:tcPr>
           <w:p>
             <w:pPr>
@@ -12170,6 +14356,7 @@
         <w:tc>
           <w:tcPr>
             <w:tcW w:w="3544" w:type="dxa"/>
+            <w:shd w:val="clear" w:color="auto" w:fill="F79646" w:themeFill="accent6"/>
           </w:tcPr>
           <w:p>
             <w:pPr>
@@ -12180,11 +14367,26 @@
             </w:r>
           </w:p>
         </w:tc>
+        <w:tc>
+          <w:tcPr>
+            <w:tcW w:w="708" w:type="dxa"/>
+            <w:shd w:val="clear" w:color="auto" w:fill="F79646" w:themeFill="accent6"/>
+          </w:tcPr>
+          <w:p>
+            <w:pPr>
+              <w:spacing w:line="360" w:lineRule="auto"/>
+            </w:pPr>
+            <w:r>
+              <w:t>9</w:t>
+            </w:r>
+          </w:p>
+        </w:tc>
       </w:tr>
       <w:tr>
         <w:tc>
           <w:tcPr>
             <w:tcW w:w="1413" w:type="dxa"/>
+            <w:shd w:val="clear" w:color="auto" w:fill="00B050"/>
           </w:tcPr>
           <w:p>
             <w:pPr>
@@ -12198,6 +14400,7 @@
         <w:tc>
           <w:tcPr>
             <w:tcW w:w="3544" w:type="dxa"/>
+            <w:shd w:val="clear" w:color="auto" w:fill="00B050"/>
           </w:tcPr>
           <w:p>
             <w:pPr>
@@ -12208,18 +14411,44 @@
             </w:r>
           </w:p>
         </w:tc>
+        <w:tc>
+          <w:tcPr>
+            <w:tcW w:w="708" w:type="dxa"/>
+            <w:shd w:val="clear" w:color="auto" w:fill="00B050"/>
+          </w:tcPr>
+          <w:p>
+            <w:pPr>
+              <w:spacing w:line="360" w:lineRule="auto"/>
+            </w:pPr>
+            <w:r>
+              <w:t>10</w:t>
+            </w:r>
+          </w:p>
+        </w:tc>
       </w:tr>
     </w:tbl>
     <w:p>
       <w:pPr>
         <w:spacing w:line="360" w:lineRule="auto"/>
+        <w:rPr>
+          <w:sz w:val="28"/>
+          <w:szCs w:val="28"/>
+        </w:rPr>
       </w:pPr>
     </w:p>
     <w:p>
       <w:pPr>
         <w:spacing w:line="360" w:lineRule="auto"/>
-      </w:pPr>
-      <w:r>
+        <w:rPr>
+          <w:sz w:val="28"/>
+          <w:szCs w:val="28"/>
+        </w:rPr>
+      </w:pPr>
+      <w:r>
+        <w:rPr>
+          <w:sz w:val="28"/>
+          <w:szCs w:val="28"/>
+        </w:rPr>
         <w:t>Результаты обоих сортировок</w:t>
       </w:r>
     </w:p>
@@ -12239,6 +14468,7 @@
         <w:tc>
           <w:tcPr>
             <w:tcW w:w="1413" w:type="dxa"/>
+            <w:shd w:val="clear" w:color="auto" w:fill="00B050"/>
           </w:tcPr>
           <w:p>
             <w:pPr>
@@ -12252,6 +14482,7 @@
         <w:tc>
           <w:tcPr>
             <w:tcW w:w="3544" w:type="dxa"/>
+            <w:shd w:val="clear" w:color="auto" w:fill="00B050"/>
           </w:tcPr>
           <w:p>
             <w:pPr>
@@ -12265,6 +14496,7 @@
         <w:tc>
           <w:tcPr>
             <w:tcW w:w="708" w:type="dxa"/>
+            <w:shd w:val="clear" w:color="auto" w:fill="00B050"/>
           </w:tcPr>
           <w:p>
             <w:pPr>
@@ -12280,6 +14512,7 @@
         <w:tc>
           <w:tcPr>
             <w:tcW w:w="1413" w:type="dxa"/>
+            <w:shd w:val="clear" w:color="auto" w:fill="00B050"/>
           </w:tcPr>
           <w:p>
             <w:pPr>
@@ -12293,6 +14526,7 @@
         <w:tc>
           <w:tcPr>
             <w:tcW w:w="3544" w:type="dxa"/>
+            <w:shd w:val="clear" w:color="auto" w:fill="00B050"/>
           </w:tcPr>
           <w:p>
             <w:pPr>
@@ -12306,6 +14540,7 @@
         <w:tc>
           <w:tcPr>
             <w:tcW w:w="708" w:type="dxa"/>
+            <w:shd w:val="clear" w:color="auto" w:fill="00B050"/>
           </w:tcPr>
           <w:p>
             <w:pPr>
@@ -12321,6 +14556,7 @@
         <w:tc>
           <w:tcPr>
             <w:tcW w:w="1413" w:type="dxa"/>
+            <w:shd w:val="clear" w:color="auto" w:fill="00B050"/>
           </w:tcPr>
           <w:p>
             <w:pPr>
@@ -12334,6 +14570,7 @@
         <w:tc>
           <w:tcPr>
             <w:tcW w:w="3544" w:type="dxa"/>
+            <w:shd w:val="clear" w:color="auto" w:fill="00B050"/>
           </w:tcPr>
           <w:p>
             <w:pPr>
@@ -12347,6 +14584,7 @@
         <w:tc>
           <w:tcPr>
             <w:tcW w:w="708" w:type="dxa"/>
+            <w:shd w:val="clear" w:color="auto" w:fill="00B050"/>
           </w:tcPr>
           <w:p>
             <w:pPr>
@@ -12362,6 +14600,7 @@
         <w:tc>
           <w:tcPr>
             <w:tcW w:w="1413" w:type="dxa"/>
+            <w:shd w:val="clear" w:color="auto" w:fill="00B050"/>
           </w:tcPr>
           <w:p>
             <w:pPr>
@@ -12375,6 +14614,7 @@
         <w:tc>
           <w:tcPr>
             <w:tcW w:w="3544" w:type="dxa"/>
+            <w:shd w:val="clear" w:color="auto" w:fill="00B050"/>
           </w:tcPr>
           <w:p>
             <w:pPr>
@@ -12388,6 +14628,7 @@
         <w:tc>
           <w:tcPr>
             <w:tcW w:w="708" w:type="dxa"/>
+            <w:shd w:val="clear" w:color="auto" w:fill="00B050"/>
           </w:tcPr>
           <w:p>
             <w:pPr>
@@ -12403,6 +14644,7 @@
         <w:tc>
           <w:tcPr>
             <w:tcW w:w="1413" w:type="dxa"/>
+            <w:shd w:val="clear" w:color="auto" w:fill="00B050"/>
           </w:tcPr>
           <w:p>
             <w:pPr>
@@ -12416,6 +14658,7 @@
         <w:tc>
           <w:tcPr>
             <w:tcW w:w="3544" w:type="dxa"/>
+            <w:shd w:val="clear" w:color="auto" w:fill="00B050"/>
           </w:tcPr>
           <w:p>
             <w:pPr>
@@ -12429,6 +14672,7 @@
         <w:tc>
           <w:tcPr>
             <w:tcW w:w="708" w:type="dxa"/>
+            <w:shd w:val="clear" w:color="auto" w:fill="00B050"/>
           </w:tcPr>
           <w:p>
             <w:pPr>
@@ -12444,6 +14688,7 @@
         <w:tc>
           <w:tcPr>
             <w:tcW w:w="1413" w:type="dxa"/>
+            <w:shd w:val="clear" w:color="auto" w:fill="F79646" w:themeFill="accent6"/>
           </w:tcPr>
           <w:p>
             <w:pPr>
@@ -12457,6 +14702,7 @@
         <w:tc>
           <w:tcPr>
             <w:tcW w:w="3544" w:type="dxa"/>
+            <w:shd w:val="clear" w:color="auto" w:fill="F79646" w:themeFill="accent6"/>
           </w:tcPr>
           <w:p>
             <w:pPr>
@@ -12470,6 +14716,7 @@
         <w:tc>
           <w:tcPr>
             <w:tcW w:w="708" w:type="dxa"/>
+            <w:shd w:val="clear" w:color="auto" w:fill="F79646" w:themeFill="accent6"/>
           </w:tcPr>
           <w:p>
             <w:pPr>
@@ -12485,6 +14732,7 @@
         <w:tc>
           <w:tcPr>
             <w:tcW w:w="1413" w:type="dxa"/>
+            <w:shd w:val="clear" w:color="auto" w:fill="F79646" w:themeFill="accent6"/>
           </w:tcPr>
           <w:p>
             <w:pPr>
@@ -12498,6 +14746,7 @@
         <w:tc>
           <w:tcPr>
             <w:tcW w:w="3544" w:type="dxa"/>
+            <w:shd w:val="clear" w:color="auto" w:fill="F79646" w:themeFill="accent6"/>
           </w:tcPr>
           <w:p>
             <w:pPr>
@@ -12511,6 +14760,7 @@
         <w:tc>
           <w:tcPr>
             <w:tcW w:w="708" w:type="dxa"/>
+            <w:shd w:val="clear" w:color="auto" w:fill="F79646" w:themeFill="accent6"/>
           </w:tcPr>
           <w:p>
             <w:pPr>
@@ -12526,6 +14776,7 @@
         <w:tc>
           <w:tcPr>
             <w:tcW w:w="1413" w:type="dxa"/>
+            <w:shd w:val="clear" w:color="auto" w:fill="F79646" w:themeFill="accent6"/>
           </w:tcPr>
           <w:p>
             <w:pPr>
@@ -12539,6 +14790,7 @@
         <w:tc>
           <w:tcPr>
             <w:tcW w:w="3544" w:type="dxa"/>
+            <w:shd w:val="clear" w:color="auto" w:fill="F79646" w:themeFill="accent6"/>
           </w:tcPr>
           <w:p>
             <w:pPr>
@@ -12552,6 +14804,7 @@
         <w:tc>
           <w:tcPr>
             <w:tcW w:w="708" w:type="dxa"/>
+            <w:shd w:val="clear" w:color="auto" w:fill="F79646" w:themeFill="accent6"/>
           </w:tcPr>
           <w:p>
             <w:pPr>
@@ -12567,6 +14820,7 @@
         <w:tc>
           <w:tcPr>
             <w:tcW w:w="1413" w:type="dxa"/>
+            <w:shd w:val="clear" w:color="auto" w:fill="F79646" w:themeFill="accent6"/>
           </w:tcPr>
           <w:p>
             <w:pPr>
@@ -12580,6 +14834,7 @@
         <w:tc>
           <w:tcPr>
             <w:tcW w:w="3544" w:type="dxa"/>
+            <w:shd w:val="clear" w:color="auto" w:fill="F79646" w:themeFill="accent6"/>
           </w:tcPr>
           <w:p>
             <w:pPr>
@@ -12593,6 +14848,7 @@
         <w:tc>
           <w:tcPr>
             <w:tcW w:w="708" w:type="dxa"/>
+            <w:shd w:val="clear" w:color="auto" w:fill="F79646" w:themeFill="accent6"/>
           </w:tcPr>
           <w:p>
             <w:pPr>
@@ -12608,6 +14864,7 @@
         <w:tc>
           <w:tcPr>
             <w:tcW w:w="1413" w:type="dxa"/>
+            <w:shd w:val="clear" w:color="auto" w:fill="F79646" w:themeFill="accent6"/>
           </w:tcPr>
           <w:p>
             <w:pPr>
@@ -12621,6 +14878,7 @@
         <w:tc>
           <w:tcPr>
             <w:tcW w:w="3544" w:type="dxa"/>
+            <w:shd w:val="clear" w:color="auto" w:fill="F79646" w:themeFill="accent6"/>
           </w:tcPr>
           <w:p>
             <w:pPr>
@@ -12634,6 +14892,7 @@
         <w:tc>
           <w:tcPr>
             <w:tcW w:w="708" w:type="dxa"/>
+            <w:shd w:val="clear" w:color="auto" w:fill="F79646" w:themeFill="accent6"/>
           </w:tcPr>
           <w:p>
             <w:pPr>
@@ -12654,15 +14913,18 @@
     <w:p>
       <w:pPr>
         <w:spacing w:line="360" w:lineRule="auto"/>
-      </w:pPr>
-      <w:r>
-        <w:t>По результатам обе сортировки стабильны</w:t>
-      </w:r>
-      <w:r>
-        <w:t>,</w:t>
-      </w:r>
-      <w:r>
-        <w:t xml:space="preserve"> т.е. сохраняют порядок индексов при одинаковых значениях.</w:t>
+        <w:rPr>
+          <w:sz w:val="28"/>
+          <w:szCs w:val="28"/>
+        </w:rPr>
+      </w:pPr>
+      <w:r>
+        <w:rPr>
+          <w:sz w:val="28"/>
+          <w:szCs w:val="28"/>
+        </w:rPr>
+        <w:lastRenderedPageBreak/>
+        <w:t>По результатам обе сортировки стабильны, т.е. сохраняют порядок индексов при одинаковых значениях.</w:t>
       </w:r>
     </w:p>
     <w:p>
@@ -12676,16 +14938,16 @@
         <w:rPr>
           <w:b/>
           <w:bCs/>
-          <w:sz w:val="28"/>
-          <w:szCs w:val="28"/>
+          <w:sz w:val="32"/>
+          <w:szCs w:val="32"/>
         </w:rPr>
       </w:pPr>
       <w:r>
         <w:rPr>
           <w:b/>
           <w:bCs/>
-          <w:sz w:val="28"/>
-          <w:szCs w:val="28"/>
+          <w:sz w:val="32"/>
+          <w:szCs w:val="32"/>
         </w:rPr>
         <w:t>Вывод</w:t>
       </w:r>
@@ -12693,63 +14955,49 @@
     <w:p>
       <w:pPr>
         <w:spacing w:line="360" w:lineRule="auto"/>
-      </w:pPr>
-      <w:r>
-        <w:lastRenderedPageBreak/>
-        <w:t>Сравнение алгоритмов сортировки прямыми вставками и естественным слиянием показало превосходство алгоритм</w:t>
-      </w:r>
-      <w:r>
-        <w:t xml:space="preserve">а </w:t>
-      </w:r>
-      <w:r>
-        <w:t>“</w:t>
-      </w:r>
-      <w:r>
-        <w:t>естественн</w:t>
-      </w:r>
-      <w:r>
-        <w:t xml:space="preserve">ое </w:t>
-      </w:r>
-      <w:r>
-        <w:t>слияние</w:t>
-      </w:r>
-      <w:r>
-        <w:t>”</w:t>
-      </w:r>
-      <w:r>
-        <w:t xml:space="preserve"> с линейно-логарифмической сложностью O(n </w:t>
-      </w:r>
-      <w:proofErr w:type="spellStart"/>
-      <w:r>
+        <w:rPr>
+          <w:sz w:val="28"/>
+          <w:szCs w:val="28"/>
+        </w:rPr>
+      </w:pPr>
+      <w:r>
+        <w:rPr>
+          <w:sz w:val="28"/>
+          <w:szCs w:val="28"/>
+        </w:rPr>
+        <w:t xml:space="preserve">Сравнение алгоритмов сортировки прямыми вставками и естественным слиянием показало превосходство алгоритма “естественное слияние” с линейно-логарифмической сложностью </w:t>
+      </w:r>
+      <w:proofErr w:type="gramStart"/>
+      <w:r>
+        <w:rPr>
+          <w:sz w:val="28"/>
+          <w:szCs w:val="28"/>
+        </w:rPr>
+        <w:t>O(</w:t>
+      </w:r>
+      <w:proofErr w:type="gramEnd"/>
+      <w:r>
+        <w:rPr>
+          <w:sz w:val="28"/>
+          <w:szCs w:val="28"/>
+        </w:rPr>
+        <w:t xml:space="preserve">n </w:t>
+      </w:r>
+      <w:proofErr w:type="spellStart"/>
+      <w:r>
+        <w:rPr>
+          <w:sz w:val="28"/>
+          <w:szCs w:val="28"/>
+        </w:rPr>
         <w:t>log</w:t>
       </w:r>
       <w:proofErr w:type="spellEnd"/>
       <w:r>
-        <w:t xml:space="preserve"> n) над алгоритм</w:t>
-      </w:r>
-      <w:r>
-        <w:t xml:space="preserve">ом </w:t>
-      </w:r>
-      <w:r>
-        <w:t xml:space="preserve">“ </w:t>
-      </w:r>
-      <w:r>
-        <w:t>прямы</w:t>
-      </w:r>
-      <w:r>
-        <w:t>е</w:t>
-      </w:r>
-      <w:r>
-        <w:t xml:space="preserve"> вставк</w:t>
-      </w:r>
-      <w:r>
-        <w:t>и</w:t>
-      </w:r>
-      <w:r>
-        <w:t>”</w:t>
-      </w:r>
-      <w:r>
-        <w:t xml:space="preserve"> с квадратичной сложностью O(n²) на больших объемах данных.</w:t>
+        <w:rPr>
+          <w:sz w:val="28"/>
+          <w:szCs w:val="28"/>
+        </w:rPr>
+        <w:t xml:space="preserve"> n) над алгоритмом “ прямые вставки” с квадратичной сложностью O(n²) на больших объемах данных.</w:t>
       </w:r>
     </w:p>
     <w:sectPr>
@@ -14449,15 +16697,19 @@
   <w:abstractNum w:abstractNumId="16" w15:restartNumberingAfterBreak="0">
     <w:nsid w:val="7A4C7B9B"/>
     <w:multiLevelType w:val="hybridMultilevel"/>
-    <w:tmpl w:val="7D4C3E00"/>
-    <w:lvl w:ilvl="0" w:tplc="0419000F">
+    <w:tmpl w:val="2E606C28"/>
+    <w:lvl w:ilvl="0" w:tplc="972CDB34">
       <w:start w:val="1"/>
       <w:numFmt w:val="decimal"/>
       <w:lvlText w:val="%1."/>
       <w:lvlJc w:val="left"/>
       <w:pPr>
-        <w:ind w:left="720" w:hanging="360"/>
-      </w:pPr>
+        <w:ind w:left="1069" w:hanging="360"/>
+      </w:pPr>
+      <w:rPr>
+        <w:b w:val="0"/>
+        <w:bCs/>
+      </w:rPr>
     </w:lvl>
     <w:lvl w:ilvl="1" w:tplc="04190019" w:tentative="1">
       <w:start w:val="1"/>
@@ -15392,7 +17644,7 @@
   <w:style w:type="paragraph" w:default="1" w:styleId="a">
     <w:name w:val="Normal"/>
     <w:qFormat/>
-    <w:rsid w:val="004F6844"/>
+    <w:rsid w:val="00D24322"/>
     <w:pPr>
       <w:spacing w:after="0" w:line="240" w:lineRule="auto"/>
     </w:pPr>
@@ -15631,6 +17883,567 @@
             </a:pPr>
             <a:r>
               <a:rPr lang="ru-RU"/>
+              <a:t>Отношение времени сортировок</a:t>
+            </a:r>
+          </a:p>
+        </c:rich>
+      </c:tx>
+      <c:overlay val="0"/>
+      <c:spPr>
+        <a:noFill/>
+        <a:ln>
+          <a:noFill/>
+        </a:ln>
+        <a:effectLst/>
+      </c:spPr>
+      <c:txPr>
+        <a:bodyPr rot="0" spcFirstLastPara="1" vertOverflow="ellipsis" vert="horz" wrap="square" anchor="ctr" anchorCtr="1"/>
+        <a:lstStyle/>
+        <a:p>
+          <a:pPr>
+            <a:defRPr sz="1400" b="0" i="0" u="none" strike="noStrike" kern="1200" spc="0" baseline="0">
+              <a:solidFill>
+                <a:schemeClr val="tx1">
+                  <a:lumMod val="65000"/>
+                  <a:lumOff val="35000"/>
+                </a:schemeClr>
+              </a:solidFill>
+              <a:latin typeface="+mn-lt"/>
+              <a:ea typeface="+mn-ea"/>
+              <a:cs typeface="+mn-cs"/>
+            </a:defRPr>
+          </a:pPr>
+          <a:endParaRPr lang="ru-RU"/>
+        </a:p>
+      </c:txPr>
+    </c:title>
+    <c:autoTitleDeleted val="0"/>
+    <c:plotArea>
+      <c:layout/>
+      <c:scatterChart>
+        <c:scatterStyle val="smoothMarker"/>
+        <c:varyColors val="0"/>
+        <c:ser>
+          <c:idx val="0"/>
+          <c:order val="0"/>
+          <c:tx>
+            <c:strRef>
+              <c:f>Sheet1!$K$66</c:f>
+              <c:strCache>
+                <c:ptCount val="1"/>
+                <c:pt idx="0">
+                  <c:v>Разница</c:v>
+                </c:pt>
+              </c:strCache>
+            </c:strRef>
+          </c:tx>
+          <c:spPr>
+            <a:ln w="19050" cap="rnd">
+              <a:solidFill>
+                <a:schemeClr val="accent1"/>
+              </a:solidFill>
+              <a:round/>
+            </a:ln>
+            <a:effectLst/>
+          </c:spPr>
+          <c:marker>
+            <c:symbol val="circle"/>
+            <c:size val="5"/>
+            <c:spPr>
+              <a:solidFill>
+                <a:schemeClr val="accent1"/>
+              </a:solidFill>
+              <a:ln w="9525">
+                <a:solidFill>
+                  <a:schemeClr val="accent1"/>
+                </a:solidFill>
+              </a:ln>
+              <a:effectLst/>
+            </c:spPr>
+          </c:marker>
+          <c:xVal>
+            <c:numRef>
+              <c:f>Sheet1!$J$67:$J$82</c:f>
+              <c:numCache>
+                <c:formatCode>General</c:formatCode>
+                <c:ptCount val="16"/>
+                <c:pt idx="0">
+                  <c:v>2</c:v>
+                </c:pt>
+                <c:pt idx="1">
+                  <c:v>4</c:v>
+                </c:pt>
+                <c:pt idx="2">
+                  <c:v>8</c:v>
+                </c:pt>
+                <c:pt idx="3">
+                  <c:v>16</c:v>
+                </c:pt>
+                <c:pt idx="4">
+                  <c:v>32</c:v>
+                </c:pt>
+                <c:pt idx="5">
+                  <c:v>64</c:v>
+                </c:pt>
+                <c:pt idx="6">
+                  <c:v>128</c:v>
+                </c:pt>
+                <c:pt idx="7">
+                  <c:v>256</c:v>
+                </c:pt>
+                <c:pt idx="8">
+                  <c:v>512</c:v>
+                </c:pt>
+                <c:pt idx="9">
+                  <c:v>1024</c:v>
+                </c:pt>
+                <c:pt idx="10">
+                  <c:v>2048</c:v>
+                </c:pt>
+                <c:pt idx="11">
+                  <c:v>4096</c:v>
+                </c:pt>
+                <c:pt idx="12">
+                  <c:v>8192</c:v>
+                </c:pt>
+                <c:pt idx="13">
+                  <c:v>16384</c:v>
+                </c:pt>
+                <c:pt idx="14">
+                  <c:v>32768</c:v>
+                </c:pt>
+                <c:pt idx="15">
+                  <c:v>65536</c:v>
+                </c:pt>
+              </c:numCache>
+            </c:numRef>
+          </c:xVal>
+          <c:yVal>
+            <c:numRef>
+              <c:f>Sheet1!$K$67:$K$82</c:f>
+              <c:numCache>
+                <c:formatCode>General</c:formatCode>
+                <c:ptCount val="16"/>
+                <c:pt idx="0">
+                  <c:v>2</c:v>
+                </c:pt>
+                <c:pt idx="1">
+                  <c:v>0.5</c:v>
+                </c:pt>
+                <c:pt idx="2">
+                  <c:v>1</c:v>
+                </c:pt>
+                <c:pt idx="3">
+                  <c:v>0.8</c:v>
+                </c:pt>
+                <c:pt idx="4">
+                  <c:v>0.66666666666666663</c:v>
+                </c:pt>
+                <c:pt idx="5">
+                  <c:v>1.08</c:v>
+                </c:pt>
+                <c:pt idx="6">
+                  <c:v>20.742857142857144</c:v>
+                </c:pt>
+                <c:pt idx="7">
+                  <c:v>3.574074074074074</c:v>
+                </c:pt>
+                <c:pt idx="8">
+                  <c:v>4.8659793814432986</c:v>
+                </c:pt>
+                <c:pt idx="9">
+                  <c:v>9.4648117839607195</c:v>
+                </c:pt>
+                <c:pt idx="10">
+                  <c:v>16.558108108108108</c:v>
+                </c:pt>
+                <c:pt idx="11">
+                  <c:v>31.161413562559694</c:v>
+                </c:pt>
+                <c:pt idx="12">
+                  <c:v>52.279180030679122</c:v>
+                </c:pt>
+                <c:pt idx="13">
+                  <c:v>98.636850106415324</c:v>
+                </c:pt>
+                <c:pt idx="14">
+                  <c:v>166.20630849081184</c:v>
+                </c:pt>
+                <c:pt idx="15">
+                  <c:v>251.76983750131899</c:v>
+                </c:pt>
+              </c:numCache>
+            </c:numRef>
+          </c:yVal>
+          <c:smooth val="1"/>
+          <c:extLst>
+            <c:ext xmlns:c16="http://schemas.microsoft.com/office/drawing/2014/chart" uri="{C3380CC4-5D6E-409C-BE32-E72D297353CC}">
+              <c16:uniqueId val="{00000000-AC3C-4130-A993-01BF39DF207A}"/>
+            </c:ext>
+          </c:extLst>
+        </c:ser>
+        <c:dLbls>
+          <c:showLegendKey val="0"/>
+          <c:showVal val="0"/>
+          <c:showCatName val="0"/>
+          <c:showSerName val="0"/>
+          <c:showPercent val="0"/>
+          <c:showBubbleSize val="0"/>
+        </c:dLbls>
+        <c:axId val="1591024879"/>
+        <c:axId val="1591021999"/>
+      </c:scatterChart>
+      <c:valAx>
+        <c:axId val="1591024879"/>
+        <c:scaling>
+          <c:logBase val="2"/>
+          <c:orientation val="minMax"/>
+          <c:min val="2"/>
+        </c:scaling>
+        <c:delete val="0"/>
+        <c:axPos val="b"/>
+        <c:majorGridlines>
+          <c:spPr>
+            <a:ln w="9525" cap="flat" cmpd="sng" algn="ctr">
+              <a:solidFill>
+                <a:schemeClr val="tx1">
+                  <a:lumMod val="15000"/>
+                  <a:lumOff val="85000"/>
+                </a:schemeClr>
+              </a:solidFill>
+              <a:round/>
+            </a:ln>
+            <a:effectLst/>
+          </c:spPr>
+        </c:majorGridlines>
+        <c:title>
+          <c:tx>
+            <c:rich>
+              <a:bodyPr rot="0" spcFirstLastPara="1" vertOverflow="ellipsis" vert="horz" wrap="square" anchor="ctr" anchorCtr="1"/>
+              <a:lstStyle/>
+              <a:p>
+                <a:pPr>
+                  <a:defRPr sz="1000" b="0" i="0" u="none" strike="noStrike" kern="1200" baseline="0">
+                    <a:solidFill>
+                      <a:schemeClr val="tx1">
+                        <a:lumMod val="65000"/>
+                        <a:lumOff val="35000"/>
+                      </a:schemeClr>
+                    </a:solidFill>
+                    <a:latin typeface="+mn-lt"/>
+                    <a:ea typeface="+mn-ea"/>
+                    <a:cs typeface="+mn-cs"/>
+                  </a:defRPr>
+                </a:pPr>
+                <a:r>
+                  <a:rPr lang="ru-RU"/>
+                  <a:t>количество элементов </a:t>
+                </a:r>
+                <a:r>
+                  <a:rPr lang="en-US"/>
+                  <a:t>N</a:t>
+                </a:r>
+                <a:endParaRPr lang="ru-RU"/>
+              </a:p>
+            </c:rich>
+          </c:tx>
+          <c:layout>
+            <c:manualLayout>
+              <c:xMode val="edge"/>
+              <c:yMode val="edge"/>
+              <c:x val="0.40619486994310688"/>
+              <c:y val="0.87786762668604323"/>
+            </c:manualLayout>
+          </c:layout>
+          <c:overlay val="0"/>
+          <c:spPr>
+            <a:noFill/>
+            <a:ln>
+              <a:noFill/>
+            </a:ln>
+            <a:effectLst/>
+          </c:spPr>
+          <c:txPr>
+            <a:bodyPr rot="0" spcFirstLastPara="1" vertOverflow="ellipsis" vert="horz" wrap="square" anchor="ctr" anchorCtr="1"/>
+            <a:lstStyle/>
+            <a:p>
+              <a:pPr>
+                <a:defRPr sz="1000" b="0" i="0" u="none" strike="noStrike" kern="1200" baseline="0">
+                  <a:solidFill>
+                    <a:schemeClr val="tx1">
+                      <a:lumMod val="65000"/>
+                      <a:lumOff val="35000"/>
+                    </a:schemeClr>
+                  </a:solidFill>
+                  <a:latin typeface="+mn-lt"/>
+                  <a:ea typeface="+mn-ea"/>
+                  <a:cs typeface="+mn-cs"/>
+                </a:defRPr>
+              </a:pPr>
+              <a:endParaRPr lang="ru-RU"/>
+            </a:p>
+          </c:txPr>
+        </c:title>
+        <c:numFmt formatCode="General" sourceLinked="1"/>
+        <c:majorTickMark val="none"/>
+        <c:minorTickMark val="none"/>
+        <c:tickLblPos val="nextTo"/>
+        <c:spPr>
+          <a:noFill/>
+          <a:ln w="9525" cap="flat" cmpd="sng" algn="ctr">
+            <a:solidFill>
+              <a:schemeClr val="tx1">
+                <a:lumMod val="25000"/>
+                <a:lumOff val="75000"/>
+              </a:schemeClr>
+            </a:solidFill>
+            <a:round/>
+          </a:ln>
+          <a:effectLst/>
+        </c:spPr>
+        <c:txPr>
+          <a:bodyPr rot="-60000000" spcFirstLastPara="1" vertOverflow="ellipsis" vert="horz" wrap="square" anchor="ctr" anchorCtr="1"/>
+          <a:lstStyle/>
+          <a:p>
+            <a:pPr>
+              <a:defRPr sz="900" b="0" i="0" u="none" strike="noStrike" kern="1200" baseline="0">
+                <a:solidFill>
+                  <a:schemeClr val="tx1">
+                    <a:lumMod val="65000"/>
+                    <a:lumOff val="35000"/>
+                  </a:schemeClr>
+                </a:solidFill>
+                <a:latin typeface="+mn-lt"/>
+                <a:ea typeface="+mn-ea"/>
+                <a:cs typeface="+mn-cs"/>
+              </a:defRPr>
+            </a:pPr>
+            <a:endParaRPr lang="ru-RU"/>
+          </a:p>
+        </c:txPr>
+        <c:crossAx val="1591021999"/>
+        <c:crosses val="autoZero"/>
+        <c:crossBetween val="midCat"/>
+        <c:majorUnit val="2"/>
+      </c:valAx>
+      <c:valAx>
+        <c:axId val="1591021999"/>
+        <c:scaling>
+          <c:logBase val="10"/>
+          <c:orientation val="minMax"/>
+        </c:scaling>
+        <c:delete val="0"/>
+        <c:axPos val="l"/>
+        <c:majorGridlines>
+          <c:spPr>
+            <a:ln w="9525" cap="flat" cmpd="sng" algn="ctr">
+              <a:solidFill>
+                <a:schemeClr val="tx1">
+                  <a:lumMod val="15000"/>
+                  <a:lumOff val="85000"/>
+                </a:schemeClr>
+              </a:solidFill>
+              <a:round/>
+            </a:ln>
+            <a:effectLst/>
+          </c:spPr>
+        </c:majorGridlines>
+        <c:title>
+          <c:tx>
+            <c:rich>
+              <a:bodyPr rot="-5400000" spcFirstLastPara="1" vertOverflow="ellipsis" vert="horz" wrap="square" anchor="ctr" anchorCtr="1"/>
+              <a:lstStyle/>
+              <a:p>
+                <a:pPr>
+                  <a:defRPr sz="1000" b="0" i="0" u="none" strike="noStrike" kern="1200" baseline="0">
+                    <a:solidFill>
+                      <a:schemeClr val="tx1">
+                        <a:lumMod val="65000"/>
+                        <a:lumOff val="35000"/>
+                      </a:schemeClr>
+                    </a:solidFill>
+                    <a:latin typeface="+mn-lt"/>
+                    <a:ea typeface="+mn-ea"/>
+                    <a:cs typeface="+mn-cs"/>
+                  </a:defRPr>
+                </a:pPr>
+                <a:r>
+                  <a:rPr lang="ru-RU" sz="1000" b="0" i="0" u="none" strike="noStrike" kern="1200" baseline="0">
+                    <a:solidFill>
+                      <a:sysClr val="windowText" lastClr="000000">
+                        <a:lumMod val="65000"/>
+                        <a:lumOff val="35000"/>
+                      </a:sysClr>
+                    </a:solidFill>
+                  </a:rPr>
+                  <a:t>отношение микросекунд </a:t>
+                </a:r>
+              </a:p>
+            </c:rich>
+          </c:tx>
+          <c:layout>
+            <c:manualLayout>
+              <c:xMode val="edge"/>
+              <c:yMode val="edge"/>
+              <c:x val="2.2281295211531153E-2"/>
+              <c:y val="0.21625977772028426"/>
+            </c:manualLayout>
+          </c:layout>
+          <c:overlay val="0"/>
+          <c:spPr>
+            <a:noFill/>
+            <a:ln>
+              <a:noFill/>
+            </a:ln>
+            <a:effectLst/>
+          </c:spPr>
+          <c:txPr>
+            <a:bodyPr rot="-5400000" spcFirstLastPara="1" vertOverflow="ellipsis" vert="horz" wrap="square" anchor="ctr" anchorCtr="1"/>
+            <a:lstStyle/>
+            <a:p>
+              <a:pPr>
+                <a:defRPr sz="1000" b="0" i="0" u="none" strike="noStrike" kern="1200" baseline="0">
+                  <a:solidFill>
+                    <a:schemeClr val="tx1">
+                      <a:lumMod val="65000"/>
+                      <a:lumOff val="35000"/>
+                    </a:schemeClr>
+                  </a:solidFill>
+                  <a:latin typeface="+mn-lt"/>
+                  <a:ea typeface="+mn-ea"/>
+                  <a:cs typeface="+mn-cs"/>
+                </a:defRPr>
+              </a:pPr>
+              <a:endParaRPr lang="ru-RU"/>
+            </a:p>
+          </c:txPr>
+        </c:title>
+        <c:numFmt formatCode="General" sourceLinked="1"/>
+        <c:majorTickMark val="none"/>
+        <c:minorTickMark val="none"/>
+        <c:tickLblPos val="nextTo"/>
+        <c:spPr>
+          <a:noFill/>
+          <a:ln w="9525" cap="flat" cmpd="sng" algn="ctr">
+            <a:solidFill>
+              <a:schemeClr val="tx1">
+                <a:lumMod val="25000"/>
+                <a:lumOff val="75000"/>
+              </a:schemeClr>
+            </a:solidFill>
+            <a:round/>
+          </a:ln>
+          <a:effectLst/>
+        </c:spPr>
+        <c:txPr>
+          <a:bodyPr rot="-60000000" spcFirstLastPara="1" vertOverflow="ellipsis" vert="horz" wrap="square" anchor="ctr" anchorCtr="1"/>
+          <a:lstStyle/>
+          <a:p>
+            <a:pPr>
+              <a:defRPr sz="900" b="0" i="0" u="none" strike="noStrike" kern="1200" baseline="0">
+                <a:solidFill>
+                  <a:schemeClr val="tx1">
+                    <a:lumMod val="65000"/>
+                    <a:lumOff val="35000"/>
+                  </a:schemeClr>
+                </a:solidFill>
+                <a:latin typeface="+mn-lt"/>
+                <a:ea typeface="+mn-ea"/>
+                <a:cs typeface="+mn-cs"/>
+              </a:defRPr>
+            </a:pPr>
+            <a:endParaRPr lang="ru-RU"/>
+          </a:p>
+        </c:txPr>
+        <c:crossAx val="1591024879"/>
+        <c:crosses val="autoZero"/>
+        <c:crossBetween val="midCat"/>
+      </c:valAx>
+      <c:spPr>
+        <a:noFill/>
+        <a:ln>
+          <a:noFill/>
+        </a:ln>
+        <a:effectLst/>
+      </c:spPr>
+    </c:plotArea>
+    <c:plotVisOnly val="1"/>
+    <c:dispBlanksAs val="gap"/>
+    <c:showDLblsOverMax val="0"/>
+    <c:extLst>
+      <c:ext xmlns:c16r3="http://schemas.microsoft.com/office/drawing/2017/03/chart" uri="{56B9EC1D-385E-4148-901F-78D8002777C0}">
+        <c16r3:dataDisplayOptions16>
+          <c16r3:dispNaAsBlank val="1"/>
+        </c16r3:dataDisplayOptions16>
+      </c:ext>
+    </c:extLst>
+  </c:chart>
+  <c:spPr>
+    <a:solidFill>
+      <a:schemeClr val="bg1"/>
+    </a:solidFill>
+    <a:ln w="9525" cap="flat" cmpd="sng" algn="ctr">
+      <a:solidFill>
+        <a:schemeClr val="tx1">
+          <a:lumMod val="15000"/>
+          <a:lumOff val="85000"/>
+        </a:schemeClr>
+      </a:solidFill>
+      <a:round/>
+    </a:ln>
+    <a:effectLst/>
+  </c:spPr>
+  <c:txPr>
+    <a:bodyPr/>
+    <a:lstStyle/>
+    <a:p>
+      <a:pPr>
+        <a:defRPr/>
+      </a:pPr>
+      <a:endParaRPr lang="ru-RU"/>
+    </a:p>
+  </c:txPr>
+  <c:externalData r:id="rId3">
+    <c:autoUpdate val="0"/>
+  </c:externalData>
+</c:chartSpace>
+</file>
+
+<file path=word/charts/chart2.xml><?xml version="1.0" encoding="utf-8"?>
+<c:chartSpace xmlns:c="http://schemas.openxmlformats.org/drawingml/2006/chart" xmlns:a="http://schemas.openxmlformats.org/drawingml/2006/main" xmlns:r="http://schemas.openxmlformats.org/officeDocument/2006/relationships" xmlns:c16r2="http://schemas.microsoft.com/office/drawing/2015/06/chart">
+  <c:date1904 val="0"/>
+  <c:lang val="ru-RU"/>
+  <c:roundedCorners val="0"/>
+  <mc:AlternateContent xmlns:mc="http://schemas.openxmlformats.org/markup-compatibility/2006">
+    <mc:Choice xmlns:c14="http://schemas.microsoft.com/office/drawing/2007/8/2/chart" Requires="c14">
+      <c14:style val="102"/>
+    </mc:Choice>
+    <mc:Fallback>
+      <c:style val="2"/>
+    </mc:Fallback>
+  </mc:AlternateContent>
+  <c:chart>
+    <c:title>
+      <c:tx>
+        <c:rich>
+          <a:bodyPr rot="0" spcFirstLastPara="1" vertOverflow="ellipsis" vert="horz" wrap="square" anchor="ctr" anchorCtr="1"/>
+          <a:lstStyle/>
+          <a:p>
+            <a:pPr>
+              <a:defRPr sz="1400" b="0" i="0" u="none" strike="noStrike" kern="1200" spc="0" baseline="0">
+                <a:solidFill>
+                  <a:schemeClr val="tx1">
+                    <a:lumMod val="65000"/>
+                    <a:lumOff val="35000"/>
+                  </a:schemeClr>
+                </a:solidFill>
+                <a:latin typeface="+mn-lt"/>
+                <a:ea typeface="+mn-ea"/>
+                <a:cs typeface="+mn-cs"/>
+              </a:defRPr>
+            </a:pPr>
+            <a:r>
+              <a:rPr lang="ru-RU"/>
               <a:t>Время</a:t>
             </a:r>
             <a:r>
@@ -15830,7 +18643,7 @@
           <c:smooth val="1"/>
           <c:extLst>
             <c:ext xmlns:c16="http://schemas.microsoft.com/office/drawing/2014/chart" uri="{C3380CC4-5D6E-409C-BE32-E72D297353CC}">
-              <c16:uniqueId val="{00000000-9489-47F1-A44A-30D481ECE7F7}"/>
+              <c16:uniqueId val="{00000000-B90E-49CA-B786-84864BF0B2BD}"/>
             </c:ext>
           </c:extLst>
         </c:ser>
@@ -15989,7 +18802,7 @@
           <c:smooth val="1"/>
           <c:extLst>
             <c:ext xmlns:c16="http://schemas.microsoft.com/office/drawing/2014/chart" uri="{C3380CC4-5D6E-409C-BE32-E72D297353CC}">
-              <c16:uniqueId val="{00000001-9489-47F1-A44A-30D481ECE7F7}"/>
+              <c16:uniqueId val="{00000001-B90E-49CA-B786-84864BF0B2BD}"/>
             </c:ext>
           </c:extLst>
         </c:ser>
@@ -16027,6 +18840,78 @@
             <a:effectLst/>
           </c:spPr>
         </c:majorGridlines>
+        <c:title>
+          <c:tx>
+            <c:rich>
+              <a:bodyPr rot="0" spcFirstLastPara="1" vertOverflow="ellipsis" vert="horz" wrap="square" anchor="ctr" anchorCtr="1"/>
+              <a:lstStyle/>
+              <a:p>
+                <a:pPr algn="l">
+                  <a:defRPr sz="1000" b="0" i="0" u="none" strike="noStrike" kern="1200" baseline="0">
+                    <a:solidFill>
+                      <a:schemeClr val="tx1">
+                        <a:lumMod val="65000"/>
+                        <a:lumOff val="35000"/>
+                      </a:schemeClr>
+                    </a:solidFill>
+                    <a:latin typeface="+mn-lt"/>
+                    <a:ea typeface="+mn-ea"/>
+                    <a:cs typeface="+mn-cs"/>
+                  </a:defRPr>
+                </a:pPr>
+                <a:r>
+                  <a:rPr lang="ru-RU"/>
+                  <a:t>количество</a:t>
+                </a:r>
+                <a:r>
+                  <a:rPr lang="ru-RU" baseline="0"/>
+                  <a:t> элементов </a:t>
+                </a:r>
+                <a:r>
+                  <a:rPr lang="en-US" baseline="0"/>
+                  <a:t>N</a:t>
+                </a:r>
+                <a:endParaRPr lang="ru-RU"/>
+              </a:p>
+            </c:rich>
+          </c:tx>
+          <c:layout>
+            <c:manualLayout>
+              <c:xMode val="edge"/>
+              <c:yMode val="edge"/>
+              <c:x val="0.41014171730578464"/>
+              <c:y val="0.7882848829901109"/>
+            </c:manualLayout>
+          </c:layout>
+          <c:overlay val="0"/>
+          <c:spPr>
+            <a:noFill/>
+            <a:ln>
+              <a:noFill/>
+            </a:ln>
+            <a:effectLst/>
+          </c:spPr>
+          <c:txPr>
+            <a:bodyPr rot="0" spcFirstLastPara="1" vertOverflow="ellipsis" vert="horz" wrap="square" anchor="ctr" anchorCtr="1"/>
+            <a:lstStyle/>
+            <a:p>
+              <a:pPr algn="l">
+                <a:defRPr sz="1000" b="0" i="0" u="none" strike="noStrike" kern="1200" baseline="0">
+                  <a:solidFill>
+                    <a:schemeClr val="tx1">
+                      <a:lumMod val="65000"/>
+                      <a:lumOff val="35000"/>
+                    </a:schemeClr>
+                  </a:solidFill>
+                  <a:latin typeface="+mn-lt"/>
+                  <a:ea typeface="+mn-ea"/>
+                  <a:cs typeface="+mn-cs"/>
+                </a:defRPr>
+              </a:pPr>
+              <a:endParaRPr lang="ru-RU"/>
+            </a:p>
+          </c:txPr>
+        </c:title>
         <c:numFmt formatCode="General" sourceLinked="1"/>
         <c:majorTickMark val="none"/>
         <c:minorTickMark val="none"/>
@@ -16091,6 +18976,62 @@
             <a:effectLst/>
           </c:spPr>
         </c:majorGridlines>
+        <c:title>
+          <c:tx>
+            <c:rich>
+              <a:bodyPr rot="-5400000" spcFirstLastPara="1" vertOverflow="ellipsis" vert="horz" wrap="square" anchor="ctr" anchorCtr="1"/>
+              <a:lstStyle/>
+              <a:p>
+                <a:pPr>
+                  <a:defRPr sz="1000" b="0" i="0" u="none" strike="noStrike" kern="1200" baseline="0">
+                    <a:solidFill>
+                      <a:schemeClr val="tx1">
+                        <a:lumMod val="65000"/>
+                        <a:lumOff val="35000"/>
+                      </a:schemeClr>
+                    </a:solidFill>
+                    <a:latin typeface="+mn-lt"/>
+                    <a:ea typeface="+mn-ea"/>
+                    <a:cs typeface="+mn-cs"/>
+                  </a:defRPr>
+                </a:pPr>
+                <a:r>
+                  <a:rPr lang="ru-RU" sz="1000" b="0" i="0" u="none" strike="noStrike" baseline="0"/>
+                  <a:t>микросекунды </a:t>
+                </a:r>
+                <a:endParaRPr lang="ru-RU"/>
+              </a:p>
+            </c:rich>
+          </c:tx>
+          <c:overlay val="0"/>
+          <c:spPr>
+            <a:noFill/>
+            <a:ln>
+              <a:noFill/>
+            </a:ln>
+            <a:effectLst/>
+          </c:spPr>
+          <c:txPr>
+            <a:bodyPr rot="-5400000" spcFirstLastPara="1" vertOverflow="ellipsis" vert="horz" wrap="square" anchor="ctr" anchorCtr="1"/>
+            <a:lstStyle/>
+            <a:p>
+              <a:pPr>
+                <a:defRPr sz="1000" b="0" i="0" u="none" strike="noStrike" kern="1200" baseline="0">
+                  <a:solidFill>
+                    <a:schemeClr val="tx1">
+                      <a:lumMod val="65000"/>
+                      <a:lumOff val="35000"/>
+                    </a:schemeClr>
+                  </a:solidFill>
+                  <a:latin typeface="+mn-lt"/>
+                  <a:ea typeface="+mn-ea"/>
+                  <a:cs typeface="+mn-cs"/>
+                </a:defRPr>
+              </a:pPr>
+              <a:endParaRPr lang="ru-RU"/>
+            </a:p>
+          </c:txPr>
+        </c:title>
         <c:numFmt formatCode="General" sourceLinked="1"/>
         <c:majorTickMark val="none"/>
         <c:minorTickMark val="none"/>
@@ -16171,429 +19112,6 @@
         </a:p>
       </c:txPr>
     </c:legend>
-    <c:plotVisOnly val="1"/>
-    <c:dispBlanksAs val="gap"/>
-    <c:showDLblsOverMax val="0"/>
-    <c:extLst>
-      <c:ext xmlns:c16r3="http://schemas.microsoft.com/office/drawing/2017/03/chart" uri="{56B9EC1D-385E-4148-901F-78D8002777C0}">
-        <c16r3:dataDisplayOptions16>
-          <c16r3:dispNaAsBlank val="1"/>
-        </c16r3:dataDisplayOptions16>
-      </c:ext>
-    </c:extLst>
-  </c:chart>
-  <c:spPr>
-    <a:solidFill>
-      <a:schemeClr val="bg1"/>
-    </a:solidFill>
-    <a:ln w="9525" cap="flat" cmpd="sng" algn="ctr">
-      <a:solidFill>
-        <a:schemeClr val="tx1">
-          <a:lumMod val="15000"/>
-          <a:lumOff val="85000"/>
-        </a:schemeClr>
-      </a:solidFill>
-      <a:round/>
-    </a:ln>
-    <a:effectLst/>
-  </c:spPr>
-  <c:txPr>
-    <a:bodyPr/>
-    <a:lstStyle/>
-    <a:p>
-      <a:pPr>
-        <a:defRPr/>
-      </a:pPr>
-      <a:endParaRPr lang="ru-RU"/>
-    </a:p>
-  </c:txPr>
-  <c:externalData r:id="rId3">
-    <c:autoUpdate val="0"/>
-  </c:externalData>
-</c:chartSpace>
-</file>
-
-<file path=word/charts/chart2.xml><?xml version="1.0" encoding="utf-8"?>
-<c:chartSpace xmlns:c="http://schemas.openxmlformats.org/drawingml/2006/chart" xmlns:a="http://schemas.openxmlformats.org/drawingml/2006/main" xmlns:r="http://schemas.openxmlformats.org/officeDocument/2006/relationships" xmlns:c16r2="http://schemas.microsoft.com/office/drawing/2015/06/chart">
-  <c:date1904 val="0"/>
-  <c:lang val="ru-RU"/>
-  <c:roundedCorners val="0"/>
-  <mc:AlternateContent xmlns:mc="http://schemas.openxmlformats.org/markup-compatibility/2006">
-    <mc:Choice xmlns:c14="http://schemas.microsoft.com/office/drawing/2007/8/2/chart" Requires="c14">
-      <c14:style val="102"/>
-    </mc:Choice>
-    <mc:Fallback>
-      <c:style val="2"/>
-    </mc:Fallback>
-  </mc:AlternateContent>
-  <c:chart>
-    <c:title>
-      <c:tx>
-        <c:rich>
-          <a:bodyPr rot="0" spcFirstLastPara="1" vertOverflow="ellipsis" vert="horz" wrap="square" anchor="ctr" anchorCtr="1"/>
-          <a:lstStyle/>
-          <a:p>
-            <a:pPr>
-              <a:defRPr sz="1400" b="0" i="0" u="none" strike="noStrike" kern="1200" spc="0" baseline="0">
-                <a:solidFill>
-                  <a:schemeClr val="tx1">
-                    <a:lumMod val="65000"/>
-                    <a:lumOff val="35000"/>
-                  </a:schemeClr>
-                </a:solidFill>
-                <a:latin typeface="+mn-lt"/>
-                <a:ea typeface="+mn-ea"/>
-                <a:cs typeface="+mn-cs"/>
-              </a:defRPr>
-            </a:pPr>
-            <a:r>
-              <a:rPr lang="ru-RU"/>
-              <a:t>Отношение времени сортировок</a:t>
-            </a:r>
-          </a:p>
-        </c:rich>
-      </c:tx>
-      <c:overlay val="0"/>
-      <c:spPr>
-        <a:noFill/>
-        <a:ln>
-          <a:noFill/>
-        </a:ln>
-        <a:effectLst/>
-      </c:spPr>
-      <c:txPr>
-        <a:bodyPr rot="0" spcFirstLastPara="1" vertOverflow="ellipsis" vert="horz" wrap="square" anchor="ctr" anchorCtr="1"/>
-        <a:lstStyle/>
-        <a:p>
-          <a:pPr>
-            <a:defRPr sz="1400" b="0" i="0" u="none" strike="noStrike" kern="1200" spc="0" baseline="0">
-              <a:solidFill>
-                <a:schemeClr val="tx1">
-                  <a:lumMod val="65000"/>
-                  <a:lumOff val="35000"/>
-                </a:schemeClr>
-              </a:solidFill>
-              <a:latin typeface="+mn-lt"/>
-              <a:ea typeface="+mn-ea"/>
-              <a:cs typeface="+mn-cs"/>
-            </a:defRPr>
-          </a:pPr>
-          <a:endParaRPr lang="ru-RU"/>
-        </a:p>
-      </c:txPr>
-    </c:title>
-    <c:autoTitleDeleted val="0"/>
-    <c:plotArea>
-      <c:layout/>
-      <c:scatterChart>
-        <c:scatterStyle val="smoothMarker"/>
-        <c:varyColors val="0"/>
-        <c:ser>
-          <c:idx val="0"/>
-          <c:order val="0"/>
-          <c:tx>
-            <c:strRef>
-              <c:f>Sheet1!$K$66</c:f>
-              <c:strCache>
-                <c:ptCount val="1"/>
-                <c:pt idx="0">
-                  <c:v>Разница</c:v>
-                </c:pt>
-              </c:strCache>
-            </c:strRef>
-          </c:tx>
-          <c:spPr>
-            <a:ln w="19050" cap="rnd">
-              <a:solidFill>
-                <a:schemeClr val="accent1"/>
-              </a:solidFill>
-              <a:round/>
-            </a:ln>
-            <a:effectLst/>
-          </c:spPr>
-          <c:marker>
-            <c:symbol val="circle"/>
-            <c:size val="5"/>
-            <c:spPr>
-              <a:solidFill>
-                <a:schemeClr val="accent1"/>
-              </a:solidFill>
-              <a:ln w="9525">
-                <a:solidFill>
-                  <a:schemeClr val="accent1"/>
-                </a:solidFill>
-              </a:ln>
-              <a:effectLst/>
-            </c:spPr>
-          </c:marker>
-          <c:xVal>
-            <c:numRef>
-              <c:f>Sheet1!$J$67:$J$82</c:f>
-              <c:numCache>
-                <c:formatCode>General</c:formatCode>
-                <c:ptCount val="16"/>
-                <c:pt idx="0">
-                  <c:v>2</c:v>
-                </c:pt>
-                <c:pt idx="1">
-                  <c:v>4</c:v>
-                </c:pt>
-                <c:pt idx="2">
-                  <c:v>8</c:v>
-                </c:pt>
-                <c:pt idx="3">
-                  <c:v>16</c:v>
-                </c:pt>
-                <c:pt idx="4">
-                  <c:v>32</c:v>
-                </c:pt>
-                <c:pt idx="5">
-                  <c:v>64</c:v>
-                </c:pt>
-                <c:pt idx="6">
-                  <c:v>128</c:v>
-                </c:pt>
-                <c:pt idx="7">
-                  <c:v>256</c:v>
-                </c:pt>
-                <c:pt idx="8">
-                  <c:v>512</c:v>
-                </c:pt>
-                <c:pt idx="9">
-                  <c:v>1024</c:v>
-                </c:pt>
-                <c:pt idx="10">
-                  <c:v>2048</c:v>
-                </c:pt>
-                <c:pt idx="11">
-                  <c:v>4096</c:v>
-                </c:pt>
-                <c:pt idx="12">
-                  <c:v>8192</c:v>
-                </c:pt>
-                <c:pt idx="13">
-                  <c:v>16384</c:v>
-                </c:pt>
-                <c:pt idx="14">
-                  <c:v>32768</c:v>
-                </c:pt>
-                <c:pt idx="15">
-                  <c:v>65536</c:v>
-                </c:pt>
-              </c:numCache>
-            </c:numRef>
-          </c:xVal>
-          <c:yVal>
-            <c:numRef>
-              <c:f>Sheet1!$K$67:$K$82</c:f>
-              <c:numCache>
-                <c:formatCode>General</c:formatCode>
-                <c:ptCount val="16"/>
-                <c:pt idx="0">
-                  <c:v>2</c:v>
-                </c:pt>
-                <c:pt idx="1">
-                  <c:v>0.5</c:v>
-                </c:pt>
-                <c:pt idx="2">
-                  <c:v>1</c:v>
-                </c:pt>
-                <c:pt idx="3">
-                  <c:v>0.8</c:v>
-                </c:pt>
-                <c:pt idx="4">
-                  <c:v>0.66666666666666663</c:v>
-                </c:pt>
-                <c:pt idx="5">
-                  <c:v>1.08</c:v>
-                </c:pt>
-                <c:pt idx="6">
-                  <c:v>20.742857142857144</c:v>
-                </c:pt>
-                <c:pt idx="7">
-                  <c:v>3.574074074074074</c:v>
-                </c:pt>
-                <c:pt idx="8">
-                  <c:v>4.8659793814432986</c:v>
-                </c:pt>
-                <c:pt idx="9">
-                  <c:v>9.4648117839607195</c:v>
-                </c:pt>
-                <c:pt idx="10">
-                  <c:v>16.558108108108108</c:v>
-                </c:pt>
-                <c:pt idx="11">
-                  <c:v>31.161413562559694</c:v>
-                </c:pt>
-                <c:pt idx="12">
-                  <c:v>52.279180030679122</c:v>
-                </c:pt>
-                <c:pt idx="13">
-                  <c:v>98.636850106415324</c:v>
-                </c:pt>
-                <c:pt idx="14">
-                  <c:v>166.20630849081184</c:v>
-                </c:pt>
-                <c:pt idx="15">
-                  <c:v>251.76983750131899</c:v>
-                </c:pt>
-              </c:numCache>
-            </c:numRef>
-          </c:yVal>
-          <c:smooth val="1"/>
-          <c:extLst>
-            <c:ext xmlns:c16="http://schemas.microsoft.com/office/drawing/2014/chart" uri="{C3380CC4-5D6E-409C-BE32-E72D297353CC}">
-              <c16:uniqueId val="{00000000-F71C-4B4A-B33C-BFC334F5EACC}"/>
-            </c:ext>
-          </c:extLst>
-        </c:ser>
-        <c:dLbls>
-          <c:showLegendKey val="0"/>
-          <c:showVal val="0"/>
-          <c:showCatName val="0"/>
-          <c:showSerName val="0"/>
-          <c:showPercent val="0"/>
-          <c:showBubbleSize val="0"/>
-        </c:dLbls>
-        <c:axId val="1591024879"/>
-        <c:axId val="1591021999"/>
-      </c:scatterChart>
-      <c:valAx>
-        <c:axId val="1591024879"/>
-        <c:scaling>
-          <c:logBase val="2"/>
-          <c:orientation val="minMax"/>
-          <c:min val="2"/>
-        </c:scaling>
-        <c:delete val="0"/>
-        <c:axPos val="b"/>
-        <c:majorGridlines>
-          <c:spPr>
-            <a:ln w="9525" cap="flat" cmpd="sng" algn="ctr">
-              <a:solidFill>
-                <a:schemeClr val="tx1">
-                  <a:lumMod val="15000"/>
-                  <a:lumOff val="85000"/>
-                </a:schemeClr>
-              </a:solidFill>
-              <a:round/>
-            </a:ln>
-            <a:effectLst/>
-          </c:spPr>
-        </c:majorGridlines>
-        <c:numFmt formatCode="General" sourceLinked="1"/>
-        <c:majorTickMark val="none"/>
-        <c:minorTickMark val="none"/>
-        <c:tickLblPos val="nextTo"/>
-        <c:spPr>
-          <a:noFill/>
-          <a:ln w="9525" cap="flat" cmpd="sng" algn="ctr">
-            <a:solidFill>
-              <a:schemeClr val="tx1">
-                <a:lumMod val="25000"/>
-                <a:lumOff val="75000"/>
-              </a:schemeClr>
-            </a:solidFill>
-            <a:round/>
-          </a:ln>
-          <a:effectLst/>
-        </c:spPr>
-        <c:txPr>
-          <a:bodyPr rot="-60000000" spcFirstLastPara="1" vertOverflow="ellipsis" vert="horz" wrap="square" anchor="ctr" anchorCtr="1"/>
-          <a:lstStyle/>
-          <a:p>
-            <a:pPr>
-              <a:defRPr sz="900" b="0" i="0" u="none" strike="noStrike" kern="1200" baseline="0">
-                <a:solidFill>
-                  <a:schemeClr val="tx1">
-                    <a:lumMod val="65000"/>
-                    <a:lumOff val="35000"/>
-                  </a:schemeClr>
-                </a:solidFill>
-                <a:latin typeface="+mn-lt"/>
-                <a:ea typeface="+mn-ea"/>
-                <a:cs typeface="+mn-cs"/>
-              </a:defRPr>
-            </a:pPr>
-            <a:endParaRPr lang="ru-RU"/>
-          </a:p>
-        </c:txPr>
-        <c:crossAx val="1591021999"/>
-        <c:crosses val="autoZero"/>
-        <c:crossBetween val="midCat"/>
-        <c:majorUnit val="2"/>
-      </c:valAx>
-      <c:valAx>
-        <c:axId val="1591021999"/>
-        <c:scaling>
-          <c:logBase val="10"/>
-          <c:orientation val="minMax"/>
-        </c:scaling>
-        <c:delete val="0"/>
-        <c:axPos val="l"/>
-        <c:majorGridlines>
-          <c:spPr>
-            <a:ln w="9525" cap="flat" cmpd="sng" algn="ctr">
-              <a:solidFill>
-                <a:schemeClr val="tx1">
-                  <a:lumMod val="15000"/>
-                  <a:lumOff val="85000"/>
-                </a:schemeClr>
-              </a:solidFill>
-              <a:round/>
-            </a:ln>
-            <a:effectLst/>
-          </c:spPr>
-        </c:majorGridlines>
-        <c:numFmt formatCode="General" sourceLinked="1"/>
-        <c:majorTickMark val="none"/>
-        <c:minorTickMark val="none"/>
-        <c:tickLblPos val="nextTo"/>
-        <c:spPr>
-          <a:noFill/>
-          <a:ln w="9525" cap="flat" cmpd="sng" algn="ctr">
-            <a:solidFill>
-              <a:schemeClr val="tx1">
-                <a:lumMod val="25000"/>
-                <a:lumOff val="75000"/>
-              </a:schemeClr>
-            </a:solidFill>
-            <a:round/>
-          </a:ln>
-          <a:effectLst/>
-        </c:spPr>
-        <c:txPr>
-          <a:bodyPr rot="-60000000" spcFirstLastPara="1" vertOverflow="ellipsis" vert="horz" wrap="square" anchor="ctr" anchorCtr="1"/>
-          <a:lstStyle/>
-          <a:p>
-            <a:pPr>
-              <a:defRPr sz="900" b="0" i="0" u="none" strike="noStrike" kern="1200" baseline="0">
-                <a:solidFill>
-                  <a:schemeClr val="tx1">
-                    <a:lumMod val="65000"/>
-                    <a:lumOff val="35000"/>
-                  </a:schemeClr>
-                </a:solidFill>
-                <a:latin typeface="+mn-lt"/>
-                <a:ea typeface="+mn-ea"/>
-                <a:cs typeface="+mn-cs"/>
-              </a:defRPr>
-            </a:pPr>
-            <a:endParaRPr lang="ru-RU"/>
-          </a:p>
-        </c:txPr>
-        <c:crossAx val="1591024879"/>
-        <c:crosses val="autoZero"/>
-        <c:crossBetween val="midCat"/>
-      </c:valAx>
-      <c:spPr>
-        <a:noFill/>
-        <a:ln>
-          <a:noFill/>
-        </a:ln>
-        <a:effectLst/>
-      </c:spPr>
-    </c:plotArea>
     <c:plotVisOnly val="1"/>
     <c:dispBlanksAs val="gap"/>
     <c:showDLblsOverMax val="0"/>

</xml_diff>